<commit_message>
Updated kashmirand himachal itinerary
</commit_message>
<xml_diff>
--- a/itinerary/himachal/Snehalmaushi/Himachal.docx
+++ b/itinerary/himachal/Snehalmaushi/Himachal.docx
@@ -19,7 +19,6 @@
           <w:lang w:val="en-US"/>
         </w:rPr>
       </w:pPr>
-      <w:proofErr w:type="gramStart"/>
       <w:r>
         <w:rPr>
           <w:lang w:val="en-US"/>
@@ -30,20 +29,7 @@
         <w:rPr>
           <w:lang w:val="en-US"/>
         </w:rPr>
-        <w:t xml:space="preserve"> </w:t>
-      </w:r>
-      <w:r>
-        <w:rPr>
-          <w:lang w:val="en-US"/>
-        </w:rPr>
-        <w:t xml:space="preserve"> -</w:t>
-      </w:r>
-      <w:proofErr w:type="gramEnd"/>
-      <w:r>
-        <w:rPr>
-          <w:lang w:val="en-US"/>
-        </w:rPr>
-        <w:t xml:space="preserve"> </w:t>
+        <w:t xml:space="preserve"> - </w:t>
       </w:r>
       <w:r>
         <w:rPr>
@@ -239,9 +225,19 @@
             <w:pPr>
               <w:jc w:val="center"/>
               <w:rPr>
+                <w:b/>
+                <w:bCs/>
                 <w:lang w:val="en-US"/>
               </w:rPr>
             </w:pPr>
+            <w:r>
+              <w:rPr>
+                <w:b/>
+                <w:bCs/>
+                <w:lang w:val="en-US"/>
+              </w:rPr>
+              <w:t>75000/-</w:t>
+            </w:r>
           </w:p>
         </w:tc>
         <w:tc>
@@ -253,9 +249,19 @@
             <w:pPr>
               <w:jc w:val="center"/>
               <w:rPr>
+                <w:b/>
+                <w:bCs/>
                 <w:lang w:val="en-US"/>
               </w:rPr>
             </w:pPr>
+            <w:r>
+              <w:rPr>
+                <w:b/>
+                <w:bCs/>
+                <w:lang w:val="en-US"/>
+              </w:rPr>
+              <w:t>Not included</w:t>
+            </w:r>
           </w:p>
         </w:tc>
         <w:tc>
@@ -267,9 +273,19 @@
             <w:pPr>
               <w:jc w:val="center"/>
               <w:rPr>
+                <w:b/>
+                <w:bCs/>
                 <w:lang w:val="en-US"/>
               </w:rPr>
             </w:pPr>
+            <w:r>
+              <w:rPr>
+                <w:b/>
+                <w:bCs/>
+                <w:lang w:val="en-US"/>
+              </w:rPr>
+              <w:t>75000/-</w:t>
+            </w:r>
           </w:p>
         </w:tc>
       </w:tr>
@@ -329,27 +345,27 @@
     <w:tbl>
       <w:tblPr>
         <w:tblStyle w:val="TableGrid"/>
-        <w:tblW w:w="9271" w:type="dxa"/>
+        <w:tblW w:w="9498" w:type="dxa"/>
         <w:jc w:val="center"/>
         <w:tblLook w:val="04A0" w:firstRow="1" w:lastRow="0" w:firstColumn="1" w:lastColumn="0" w:noHBand="0" w:noVBand="1"/>
       </w:tblPr>
       <w:tblGrid>
-        <w:gridCol w:w="1277"/>
-        <w:gridCol w:w="1122"/>
-        <w:gridCol w:w="1120"/>
-        <w:gridCol w:w="1236"/>
-        <w:gridCol w:w="1234"/>
-        <w:gridCol w:w="1487"/>
-        <w:gridCol w:w="1795"/>
+        <w:gridCol w:w="1875"/>
+        <w:gridCol w:w="1081"/>
+        <w:gridCol w:w="1081"/>
+        <w:gridCol w:w="1007"/>
+        <w:gridCol w:w="1391"/>
+        <w:gridCol w:w="1389"/>
+        <w:gridCol w:w="1674"/>
       </w:tblGrid>
       <w:tr>
         <w:trPr>
-          <w:trHeight w:val="291"/>
+          <w:trHeight w:val="333"/>
           <w:jc w:val="center"/>
         </w:trPr>
         <w:tc>
           <w:tcPr>
-            <w:tcW w:w="1170" w:type="dxa"/>
+            <w:tcW w:w="1875" w:type="dxa"/>
             <w:shd w:val="clear" w:color="auto" w:fill="FFD966" w:themeFill="accent4" w:themeFillTint="99"/>
           </w:tcPr>
           <w:p>
@@ -376,7 +392,7 @@
         </w:tc>
         <w:tc>
           <w:tcPr>
-            <w:tcW w:w="1133" w:type="dxa"/>
+            <w:tcW w:w="1081" w:type="dxa"/>
             <w:shd w:val="clear" w:color="auto" w:fill="FFD966" w:themeFill="accent4" w:themeFillTint="99"/>
           </w:tcPr>
           <w:p>
@@ -397,13 +413,13 @@
                 <w:color w:val="222222"/>
                 <w:lang w:eastAsia="en-IN" w:bidi="mr-IN"/>
               </w:rPr>
-              <w:t>Arrival Date</w:t>
+              <w:t>Check in</w:t>
             </w:r>
           </w:p>
         </w:tc>
         <w:tc>
           <w:tcPr>
-            <w:tcW w:w="1129" w:type="dxa"/>
+            <w:tcW w:w="1081" w:type="dxa"/>
             <w:shd w:val="clear" w:color="auto" w:fill="FFD966" w:themeFill="accent4" w:themeFillTint="99"/>
           </w:tcPr>
           <w:p>
@@ -424,13 +440,13 @@
                 <w:color w:val="222222"/>
                 <w:lang w:eastAsia="en-IN" w:bidi="mr-IN"/>
               </w:rPr>
-              <w:t>No of people</w:t>
+              <w:t>Check out</w:t>
             </w:r>
           </w:p>
         </w:tc>
         <w:tc>
           <w:tcPr>
-            <w:tcW w:w="1249" w:type="dxa"/>
+            <w:tcW w:w="1007" w:type="dxa"/>
             <w:shd w:val="clear" w:color="auto" w:fill="FFD966" w:themeFill="accent4" w:themeFillTint="99"/>
           </w:tcPr>
           <w:p>
@@ -451,13 +467,13 @@
                 <w:color w:val="222222"/>
                 <w:lang w:eastAsia="en-IN" w:bidi="mr-IN"/>
               </w:rPr>
-              <w:t>Rooms</w:t>
+              <w:t>No of people</w:t>
             </w:r>
           </w:p>
         </w:tc>
         <w:tc>
           <w:tcPr>
-            <w:tcW w:w="1252" w:type="dxa"/>
+            <w:tcW w:w="1391" w:type="dxa"/>
             <w:shd w:val="clear" w:color="auto" w:fill="FFD966" w:themeFill="accent4" w:themeFillTint="99"/>
           </w:tcPr>
           <w:p>
@@ -478,13 +494,13 @@
                 <w:color w:val="222222"/>
                 <w:lang w:eastAsia="en-IN" w:bidi="mr-IN"/>
               </w:rPr>
-              <w:t>Meal</w:t>
+              <w:t>Rooms</w:t>
             </w:r>
           </w:p>
         </w:tc>
         <w:tc>
           <w:tcPr>
-            <w:tcW w:w="1507" w:type="dxa"/>
+            <w:tcW w:w="1389" w:type="dxa"/>
             <w:shd w:val="clear" w:color="auto" w:fill="FFD966" w:themeFill="accent4" w:themeFillTint="99"/>
           </w:tcPr>
           <w:p>
@@ -505,13 +521,13 @@
                 <w:color w:val="222222"/>
                 <w:lang w:eastAsia="en-IN" w:bidi="mr-IN"/>
               </w:rPr>
-              <w:t>Vehicle</w:t>
+              <w:t>Meal</w:t>
             </w:r>
           </w:p>
         </w:tc>
         <w:tc>
           <w:tcPr>
-            <w:tcW w:w="1831" w:type="dxa"/>
+            <w:tcW w:w="1674" w:type="dxa"/>
             <w:shd w:val="clear" w:color="auto" w:fill="FFD966" w:themeFill="accent4" w:themeFillTint="99"/>
           </w:tcPr>
           <w:p>
@@ -532,21 +548,46 @@
                 <w:color w:val="222222"/>
                 <w:lang w:eastAsia="en-IN" w:bidi="mr-IN"/>
               </w:rPr>
-              <w:t>Hotel</w:t>
+              <w:t>Vehicle</w:t>
             </w:r>
           </w:p>
         </w:tc>
       </w:tr>
       <w:tr>
         <w:trPr>
-          <w:trHeight w:val="1440"/>
+          <w:trHeight w:val="606"/>
           <w:jc w:val="center"/>
         </w:trPr>
         <w:tc>
           <w:tcPr>
-            <w:tcW w:w="1170" w:type="dxa"/>
+            <w:tcW w:w="1875" w:type="dxa"/>
             <w:shd w:val="clear" w:color="auto" w:fill="FFF2CC" w:themeFill="accent4" w:themeFillTint="33"/>
           </w:tcPr>
+          <w:p>
+            <w:pPr>
+              <w:rPr>
+                <w:rFonts w:ascii="Calibri" w:eastAsia="Times New Roman" w:hAnsi="Calibri" w:cs="Calibri"/>
+                <w:color w:val="000000"/>
+                <w:lang w:bidi="mr-IN"/>
+              </w:rPr>
+            </w:pPr>
+            <w:r>
+              <w:rPr>
+                <w:rFonts w:ascii="Calibri" w:eastAsia="Times New Roman" w:hAnsi="Calibri" w:cs="Calibri"/>
+                <w:color w:val="000000"/>
+                <w:lang w:bidi="mr-IN"/>
+              </w:rPr>
+              <w:t>0</w:t>
+            </w:r>
+            <w:r>
+              <w:rPr>
+                <w:rFonts w:ascii="Calibri" w:eastAsia="Times New Roman" w:hAnsi="Calibri" w:cs="Calibri"/>
+                <w:color w:val="000000"/>
+                <w:lang w:bidi="mr-IN"/>
+              </w:rPr>
+              <w:t>2 N Dalhousie</w:t>
+            </w:r>
+          </w:p>
           <w:p>
             <w:pPr>
               <w:rPr>
@@ -559,7 +600,7 @@
         </w:tc>
         <w:tc>
           <w:tcPr>
-            <w:tcW w:w="1133" w:type="dxa"/>
+            <w:tcW w:w="1081" w:type="dxa"/>
             <w:shd w:val="clear" w:color="auto" w:fill="FFF2CC" w:themeFill="accent4" w:themeFillTint="33"/>
           </w:tcPr>
           <w:p>
@@ -570,11 +611,19 @@
                 <w:lang w:eastAsia="en-IN" w:bidi="mr-IN"/>
               </w:rPr>
             </w:pPr>
+            <w:r>
+              <w:rPr>
+                <w:rFonts w:eastAsia="Times New Roman" w:cstheme="minorHAnsi"/>
+                <w:color w:val="222222"/>
+                <w:lang w:eastAsia="en-IN" w:bidi="mr-IN"/>
+              </w:rPr>
+              <w:t>05 Apr</w:t>
+            </w:r>
           </w:p>
         </w:tc>
         <w:tc>
           <w:tcPr>
-            <w:tcW w:w="1129" w:type="dxa"/>
+            <w:tcW w:w="1081" w:type="dxa"/>
             <w:shd w:val="clear" w:color="auto" w:fill="FFF2CC" w:themeFill="accent4" w:themeFillTint="33"/>
           </w:tcPr>
           <w:p>
@@ -585,11 +634,19 @@
                 <w:lang w:eastAsia="en-IN" w:bidi="mr-IN"/>
               </w:rPr>
             </w:pPr>
+            <w:r>
+              <w:rPr>
+                <w:rFonts w:eastAsia="Times New Roman" w:cstheme="minorHAnsi"/>
+                <w:color w:val="222222"/>
+                <w:lang w:eastAsia="en-IN" w:bidi="mr-IN"/>
+              </w:rPr>
+              <w:t>07 Apr</w:t>
+            </w:r>
           </w:p>
         </w:tc>
         <w:tc>
           <w:tcPr>
-            <w:tcW w:w="1249" w:type="dxa"/>
+            <w:tcW w:w="1007" w:type="dxa"/>
             <w:shd w:val="clear" w:color="auto" w:fill="FFF2CC" w:themeFill="accent4" w:themeFillTint="33"/>
           </w:tcPr>
           <w:p>
@@ -600,12 +657,21 @@
                 <w:lang w:eastAsia="en-IN" w:bidi="mr-IN"/>
               </w:rPr>
             </w:pPr>
+            <w:r>
+              <w:rPr>
+                <w:rFonts w:eastAsia="Times New Roman" w:cstheme="minorHAnsi"/>
+                <w:color w:val="222222"/>
+                <w:lang w:eastAsia="en-IN" w:bidi="mr-IN"/>
+              </w:rPr>
+              <w:t>03</w:t>
+            </w:r>
           </w:p>
         </w:tc>
         <w:tc>
           <w:tcPr>
-            <w:tcW w:w="1252" w:type="dxa"/>
+            <w:tcW w:w="1391" w:type="dxa"/>
             <w:shd w:val="clear" w:color="auto" w:fill="FFF2CC" w:themeFill="accent4" w:themeFillTint="33"/>
+            <w:vAlign w:val="center"/>
           </w:tcPr>
           <w:p>
             <w:pPr>
@@ -615,12 +681,29 @@
                 <w:lang w:eastAsia="en-IN" w:bidi="mr-IN"/>
               </w:rPr>
             </w:pPr>
+            <w:r>
+              <w:rPr>
+                <w:rFonts w:ascii="Calibri" w:eastAsia="Times New Roman" w:hAnsi="Calibri" w:cs="Calibri"/>
+                <w:color w:val="222222"/>
+                <w:lang w:bidi="mr-IN"/>
+              </w:rPr>
+              <w:t>0</w:t>
+            </w:r>
+            <w:r>
+              <w:rPr>
+                <w:rFonts w:ascii="Calibri" w:eastAsia="Times New Roman" w:hAnsi="Calibri" w:cs="Calibri"/>
+                <w:color w:val="222222"/>
+                <w:lang w:bidi="mr-IN"/>
+              </w:rPr>
+              <w:t>1 Room  with Extra Mattress</w:t>
+            </w:r>
           </w:p>
         </w:tc>
         <w:tc>
           <w:tcPr>
-            <w:tcW w:w="1507" w:type="dxa"/>
+            <w:tcW w:w="1389" w:type="dxa"/>
             <w:shd w:val="clear" w:color="auto" w:fill="FFF2CC" w:themeFill="accent4" w:themeFillTint="33"/>
+            <w:vAlign w:val="center"/>
           </w:tcPr>
           <w:p>
             <w:pPr>
@@ -630,11 +713,19 @@
                 <w:lang w:eastAsia="en-IN" w:bidi="mr-IN"/>
               </w:rPr>
             </w:pPr>
+            <w:r>
+              <w:rPr>
+                <w:rFonts w:ascii="Calibri" w:eastAsia="Times New Roman" w:hAnsi="Calibri" w:cs="Calibri"/>
+                <w:color w:val="222222"/>
+                <w:lang w:bidi="mr-IN"/>
+              </w:rPr>
+              <w:t>Breakfast and Dinner</w:t>
+            </w:r>
           </w:p>
         </w:tc>
         <w:tc>
           <w:tcPr>
-            <w:tcW w:w="1831" w:type="dxa"/>
+            <w:tcW w:w="1674" w:type="dxa"/>
             <w:shd w:val="clear" w:color="auto" w:fill="FFF2CC" w:themeFill="accent4" w:themeFillTint="33"/>
           </w:tcPr>
           <w:p>
@@ -645,428 +736,612 @@
                 <w:lang w:eastAsia="en-IN" w:bidi="mr-IN"/>
               </w:rPr>
             </w:pPr>
+            <w:r>
+              <w:rPr>
+                <w:rFonts w:ascii="Calibri" w:eastAsia="Times New Roman" w:hAnsi="Calibri" w:cs="Calibri"/>
+                <w:color w:val="222222"/>
+                <w:lang w:bidi="mr-IN"/>
+              </w:rPr>
+              <w:t>SEDAN</w:t>
+            </w:r>
+          </w:p>
+        </w:tc>
+      </w:tr>
+      <w:tr>
+        <w:trPr>
+          <w:trHeight w:val="606"/>
+          <w:jc w:val="center"/>
+        </w:trPr>
+        <w:tc>
+          <w:tcPr>
+            <w:tcW w:w="1875" w:type="dxa"/>
+            <w:shd w:val="clear" w:color="auto" w:fill="FFF2CC" w:themeFill="accent4" w:themeFillTint="33"/>
+          </w:tcPr>
+          <w:p>
+            <w:pPr>
+              <w:rPr>
+                <w:rFonts w:ascii="Calibri" w:eastAsia="Times New Roman" w:hAnsi="Calibri" w:cs="Calibri"/>
+                <w:color w:val="000000"/>
+                <w:lang w:bidi="mr-IN"/>
+              </w:rPr>
+            </w:pPr>
+            <w:r>
+              <w:rPr>
+                <w:rFonts w:ascii="Calibri" w:eastAsia="Times New Roman" w:hAnsi="Calibri" w:cs="Calibri"/>
+                <w:color w:val="000000"/>
+                <w:lang w:bidi="mr-IN"/>
+              </w:rPr>
+              <w:t>0</w:t>
+            </w:r>
+            <w:r>
+              <w:rPr>
+                <w:rFonts w:ascii="Calibri" w:eastAsia="Times New Roman" w:hAnsi="Calibri" w:cs="Calibri"/>
+                <w:color w:val="000000"/>
+                <w:lang w:bidi="mr-IN"/>
+              </w:rPr>
+              <w:t xml:space="preserve">1 N </w:t>
+            </w:r>
+            <w:proofErr w:type="spellStart"/>
+            <w:r>
+              <w:rPr>
+                <w:rFonts w:ascii="Calibri" w:eastAsia="Times New Roman" w:hAnsi="Calibri" w:cs="Calibri"/>
+                <w:color w:val="000000"/>
+                <w:lang w:bidi="mr-IN"/>
+              </w:rPr>
+              <w:t>Dhar</w:t>
+            </w:r>
+            <w:r>
+              <w:rPr>
+                <w:rFonts w:ascii="Calibri" w:eastAsia="Times New Roman" w:hAnsi="Calibri" w:cs="Calibri"/>
+                <w:color w:val="000000"/>
+                <w:lang w:bidi="mr-IN"/>
+              </w:rPr>
+              <w:t>a</w:t>
+            </w:r>
+            <w:r>
+              <w:rPr>
+                <w:rFonts w:ascii="Calibri" w:eastAsia="Times New Roman" w:hAnsi="Calibri" w:cs="Calibri"/>
+                <w:color w:val="000000"/>
+                <w:lang w:bidi="mr-IN"/>
+              </w:rPr>
+              <w:t>mshala</w:t>
+            </w:r>
+            <w:proofErr w:type="spellEnd"/>
+          </w:p>
+        </w:tc>
+        <w:tc>
+          <w:tcPr>
+            <w:tcW w:w="1081" w:type="dxa"/>
+            <w:shd w:val="clear" w:color="auto" w:fill="FFF2CC" w:themeFill="accent4" w:themeFillTint="33"/>
+          </w:tcPr>
+          <w:p>
+            <w:pPr>
+              <w:rPr>
+                <w:rFonts w:eastAsia="Times New Roman" w:cstheme="minorHAnsi"/>
+                <w:color w:val="222222"/>
+                <w:lang w:eastAsia="en-IN" w:bidi="mr-IN"/>
+              </w:rPr>
+            </w:pPr>
+            <w:r>
+              <w:rPr>
+                <w:rFonts w:eastAsia="Times New Roman" w:cstheme="minorHAnsi"/>
+                <w:color w:val="222222"/>
+                <w:lang w:eastAsia="en-IN" w:bidi="mr-IN"/>
+              </w:rPr>
+              <w:t>07 Apr</w:t>
+            </w:r>
+          </w:p>
+        </w:tc>
+        <w:tc>
+          <w:tcPr>
+            <w:tcW w:w="1081" w:type="dxa"/>
+            <w:shd w:val="clear" w:color="auto" w:fill="FFF2CC" w:themeFill="accent4" w:themeFillTint="33"/>
+          </w:tcPr>
+          <w:p>
+            <w:pPr>
+              <w:rPr>
+                <w:rFonts w:eastAsia="Times New Roman" w:cstheme="minorHAnsi"/>
+                <w:color w:val="222222"/>
+                <w:lang w:eastAsia="en-IN" w:bidi="mr-IN"/>
+              </w:rPr>
+            </w:pPr>
+            <w:r>
+              <w:rPr>
+                <w:rFonts w:eastAsia="Times New Roman" w:cstheme="minorHAnsi"/>
+                <w:color w:val="222222"/>
+                <w:lang w:eastAsia="en-IN" w:bidi="mr-IN"/>
+              </w:rPr>
+              <w:t>08 Apr</w:t>
+            </w:r>
+          </w:p>
+        </w:tc>
+        <w:tc>
+          <w:tcPr>
+            <w:tcW w:w="1007" w:type="dxa"/>
+            <w:shd w:val="clear" w:color="auto" w:fill="FFF2CC" w:themeFill="accent4" w:themeFillTint="33"/>
+          </w:tcPr>
+          <w:p>
+            <w:pPr>
+              <w:rPr>
+                <w:rFonts w:eastAsia="Times New Roman" w:cstheme="minorHAnsi"/>
+                <w:color w:val="222222"/>
+                <w:lang w:eastAsia="en-IN" w:bidi="mr-IN"/>
+              </w:rPr>
+            </w:pPr>
+            <w:r>
+              <w:rPr>
+                <w:rFonts w:eastAsia="Times New Roman" w:cstheme="minorHAnsi"/>
+                <w:color w:val="222222"/>
+                <w:lang w:eastAsia="en-IN" w:bidi="mr-IN"/>
+              </w:rPr>
+              <w:t>03</w:t>
+            </w:r>
+          </w:p>
+        </w:tc>
+        <w:tc>
+          <w:tcPr>
+            <w:tcW w:w="1391" w:type="dxa"/>
+            <w:shd w:val="clear" w:color="auto" w:fill="FFF2CC" w:themeFill="accent4" w:themeFillTint="33"/>
+            <w:vAlign w:val="center"/>
+          </w:tcPr>
+          <w:p>
+            <w:pPr>
+              <w:rPr>
+                <w:rFonts w:eastAsia="Times New Roman" w:cstheme="minorHAnsi"/>
+                <w:color w:val="222222"/>
+                <w:lang w:eastAsia="en-IN" w:bidi="mr-IN"/>
+              </w:rPr>
+            </w:pPr>
+            <w:r>
+              <w:rPr>
+                <w:rFonts w:ascii="Calibri" w:eastAsia="Times New Roman" w:hAnsi="Calibri" w:cs="Calibri"/>
+                <w:color w:val="222222"/>
+                <w:lang w:bidi="mr-IN"/>
+              </w:rPr>
+              <w:t>0</w:t>
+            </w:r>
+            <w:r>
+              <w:rPr>
+                <w:rFonts w:ascii="Calibri" w:eastAsia="Times New Roman" w:hAnsi="Calibri" w:cs="Calibri"/>
+                <w:color w:val="222222"/>
+                <w:lang w:bidi="mr-IN"/>
+              </w:rPr>
+              <w:t>1 Room  with Extra Mattress</w:t>
+            </w:r>
+          </w:p>
+        </w:tc>
+        <w:tc>
+          <w:tcPr>
+            <w:tcW w:w="1389" w:type="dxa"/>
+            <w:shd w:val="clear" w:color="auto" w:fill="FFF2CC" w:themeFill="accent4" w:themeFillTint="33"/>
+            <w:vAlign w:val="center"/>
+          </w:tcPr>
+          <w:p>
+            <w:pPr>
+              <w:rPr>
+                <w:rFonts w:eastAsia="Times New Roman" w:cstheme="minorHAnsi"/>
+                <w:color w:val="222222"/>
+                <w:lang w:eastAsia="en-IN" w:bidi="mr-IN"/>
+              </w:rPr>
+            </w:pPr>
+            <w:r>
+              <w:rPr>
+                <w:rFonts w:ascii="Calibri" w:eastAsia="Times New Roman" w:hAnsi="Calibri" w:cs="Calibri"/>
+                <w:color w:val="222222"/>
+                <w:lang w:bidi="mr-IN"/>
+              </w:rPr>
+              <w:t>Breakfast and Dinner</w:t>
+            </w:r>
+          </w:p>
+        </w:tc>
+        <w:tc>
+          <w:tcPr>
+            <w:tcW w:w="1674" w:type="dxa"/>
+            <w:shd w:val="clear" w:color="auto" w:fill="FFF2CC" w:themeFill="accent4" w:themeFillTint="33"/>
+          </w:tcPr>
+          <w:p>
+            <w:pPr>
+              <w:rPr>
+                <w:rFonts w:eastAsia="Times New Roman" w:cstheme="minorHAnsi"/>
+                <w:color w:val="222222"/>
+                <w:lang w:eastAsia="en-IN" w:bidi="mr-IN"/>
+              </w:rPr>
+            </w:pPr>
+            <w:r>
+              <w:rPr>
+                <w:rFonts w:ascii="Calibri" w:eastAsia="Times New Roman" w:hAnsi="Calibri" w:cs="Calibri"/>
+                <w:color w:val="222222"/>
+                <w:lang w:bidi="mr-IN"/>
+              </w:rPr>
+              <w:t>SEDAN</w:t>
+            </w:r>
+          </w:p>
+        </w:tc>
+      </w:tr>
+      <w:tr>
+        <w:trPr>
+          <w:trHeight w:val="606"/>
+          <w:jc w:val="center"/>
+        </w:trPr>
+        <w:tc>
+          <w:tcPr>
+            <w:tcW w:w="1875" w:type="dxa"/>
+            <w:shd w:val="clear" w:color="auto" w:fill="FFF2CC" w:themeFill="accent4" w:themeFillTint="33"/>
+          </w:tcPr>
+          <w:p>
+            <w:pPr>
+              <w:rPr>
+                <w:rFonts w:ascii="Calibri" w:eastAsia="Times New Roman" w:hAnsi="Calibri" w:cs="Calibri"/>
+                <w:color w:val="000000"/>
+                <w:lang w:bidi="mr-IN"/>
+              </w:rPr>
+            </w:pPr>
+            <w:r>
+              <w:rPr>
+                <w:rFonts w:ascii="Calibri" w:eastAsia="Times New Roman" w:hAnsi="Calibri" w:cs="Calibri"/>
+                <w:color w:val="222222"/>
+                <w:lang w:bidi="mr-IN"/>
+              </w:rPr>
+              <w:t>0</w:t>
+            </w:r>
+            <w:r>
+              <w:rPr>
+                <w:rFonts w:ascii="Calibri" w:eastAsia="Times New Roman" w:hAnsi="Calibri" w:cs="Calibri"/>
+                <w:color w:val="222222"/>
+                <w:lang w:bidi="mr-IN"/>
+              </w:rPr>
+              <w:t xml:space="preserve">3 N </w:t>
+            </w:r>
+            <w:proofErr w:type="spellStart"/>
+            <w:r>
+              <w:rPr>
+                <w:rFonts w:ascii="Calibri" w:eastAsia="Times New Roman" w:hAnsi="Calibri" w:cs="Calibri"/>
+                <w:color w:val="222222"/>
+                <w:lang w:bidi="mr-IN"/>
+              </w:rPr>
+              <w:t>Manali</w:t>
+            </w:r>
+            <w:proofErr w:type="spellEnd"/>
+          </w:p>
+        </w:tc>
+        <w:tc>
+          <w:tcPr>
+            <w:tcW w:w="1081" w:type="dxa"/>
+            <w:shd w:val="clear" w:color="auto" w:fill="FFF2CC" w:themeFill="accent4" w:themeFillTint="33"/>
+          </w:tcPr>
+          <w:p>
+            <w:pPr>
+              <w:rPr>
+                <w:rFonts w:eastAsia="Times New Roman" w:cstheme="minorHAnsi"/>
+                <w:color w:val="222222"/>
+                <w:lang w:eastAsia="en-IN" w:bidi="mr-IN"/>
+              </w:rPr>
+            </w:pPr>
+            <w:r>
+              <w:rPr>
+                <w:rFonts w:eastAsia="Times New Roman" w:cstheme="minorHAnsi"/>
+                <w:color w:val="222222"/>
+                <w:lang w:eastAsia="en-IN" w:bidi="mr-IN"/>
+              </w:rPr>
+              <w:t>08 Apr</w:t>
+            </w:r>
+          </w:p>
+        </w:tc>
+        <w:tc>
+          <w:tcPr>
+            <w:tcW w:w="1081" w:type="dxa"/>
+            <w:shd w:val="clear" w:color="auto" w:fill="FFF2CC" w:themeFill="accent4" w:themeFillTint="33"/>
+          </w:tcPr>
+          <w:p>
+            <w:pPr>
+              <w:rPr>
+                <w:rFonts w:eastAsia="Times New Roman" w:cstheme="minorHAnsi"/>
+                <w:color w:val="222222"/>
+                <w:lang w:eastAsia="en-IN" w:bidi="mr-IN"/>
+              </w:rPr>
+            </w:pPr>
+            <w:r>
+              <w:rPr>
+                <w:rFonts w:eastAsia="Times New Roman" w:cstheme="minorHAnsi"/>
+                <w:color w:val="222222"/>
+                <w:lang w:eastAsia="en-IN" w:bidi="mr-IN"/>
+              </w:rPr>
+              <w:t>11 Apr</w:t>
+            </w:r>
+          </w:p>
+        </w:tc>
+        <w:tc>
+          <w:tcPr>
+            <w:tcW w:w="1007" w:type="dxa"/>
+            <w:shd w:val="clear" w:color="auto" w:fill="FFF2CC" w:themeFill="accent4" w:themeFillTint="33"/>
+          </w:tcPr>
+          <w:p>
+            <w:pPr>
+              <w:rPr>
+                <w:rFonts w:eastAsia="Times New Roman" w:cstheme="minorHAnsi"/>
+                <w:color w:val="222222"/>
+                <w:lang w:eastAsia="en-IN" w:bidi="mr-IN"/>
+              </w:rPr>
+            </w:pPr>
+            <w:r>
+              <w:rPr>
+                <w:rFonts w:eastAsia="Times New Roman" w:cstheme="minorHAnsi"/>
+                <w:color w:val="222222"/>
+                <w:lang w:eastAsia="en-IN" w:bidi="mr-IN"/>
+              </w:rPr>
+              <w:t>03</w:t>
+            </w:r>
+          </w:p>
+        </w:tc>
+        <w:tc>
+          <w:tcPr>
+            <w:tcW w:w="1391" w:type="dxa"/>
+            <w:shd w:val="clear" w:color="auto" w:fill="FFF2CC" w:themeFill="accent4" w:themeFillTint="33"/>
+            <w:vAlign w:val="center"/>
+          </w:tcPr>
+          <w:p>
+            <w:pPr>
+              <w:rPr>
+                <w:rFonts w:eastAsia="Times New Roman" w:cstheme="minorHAnsi"/>
+                <w:color w:val="222222"/>
+                <w:lang w:eastAsia="en-IN" w:bidi="mr-IN"/>
+              </w:rPr>
+            </w:pPr>
+            <w:r>
+              <w:rPr>
+                <w:rFonts w:ascii="Calibri" w:eastAsia="Times New Roman" w:hAnsi="Calibri" w:cs="Calibri"/>
+                <w:color w:val="222222"/>
+                <w:lang w:bidi="mr-IN"/>
+              </w:rPr>
+              <w:t>0</w:t>
+            </w:r>
+            <w:r>
+              <w:rPr>
+                <w:rFonts w:ascii="Calibri" w:eastAsia="Times New Roman" w:hAnsi="Calibri" w:cs="Calibri"/>
+                <w:color w:val="222222"/>
+                <w:lang w:bidi="mr-IN"/>
+              </w:rPr>
+              <w:t>1 Room  with Extra Mattress</w:t>
+            </w:r>
+          </w:p>
+        </w:tc>
+        <w:tc>
+          <w:tcPr>
+            <w:tcW w:w="1389" w:type="dxa"/>
+            <w:shd w:val="clear" w:color="auto" w:fill="FFF2CC" w:themeFill="accent4" w:themeFillTint="33"/>
+            <w:vAlign w:val="center"/>
+          </w:tcPr>
+          <w:p>
+            <w:pPr>
+              <w:rPr>
+                <w:rFonts w:eastAsia="Times New Roman" w:cstheme="minorHAnsi"/>
+                <w:color w:val="222222"/>
+                <w:lang w:eastAsia="en-IN" w:bidi="mr-IN"/>
+              </w:rPr>
+            </w:pPr>
+            <w:r>
+              <w:rPr>
+                <w:rFonts w:ascii="Calibri" w:eastAsia="Times New Roman" w:hAnsi="Calibri" w:cs="Calibri"/>
+                <w:color w:val="222222"/>
+                <w:lang w:bidi="mr-IN"/>
+              </w:rPr>
+              <w:t>Breakfast and Dinner</w:t>
+            </w:r>
+          </w:p>
+        </w:tc>
+        <w:tc>
+          <w:tcPr>
+            <w:tcW w:w="1674" w:type="dxa"/>
+            <w:shd w:val="clear" w:color="auto" w:fill="FFF2CC" w:themeFill="accent4" w:themeFillTint="33"/>
+          </w:tcPr>
+          <w:p>
+            <w:pPr>
+              <w:rPr>
+                <w:rFonts w:eastAsia="Times New Roman" w:cstheme="minorHAnsi"/>
+                <w:color w:val="222222"/>
+                <w:lang w:eastAsia="en-IN" w:bidi="mr-IN"/>
+              </w:rPr>
+            </w:pPr>
+            <w:r>
+              <w:rPr>
+                <w:rFonts w:ascii="Calibri" w:eastAsia="Times New Roman" w:hAnsi="Calibri" w:cs="Calibri"/>
+                <w:color w:val="222222"/>
+                <w:lang w:bidi="mr-IN"/>
+              </w:rPr>
+              <w:t>SEDAN</w:t>
+            </w:r>
+          </w:p>
+        </w:tc>
+      </w:tr>
+      <w:tr>
+        <w:trPr>
+          <w:trHeight w:val="606"/>
+          <w:jc w:val="center"/>
+        </w:trPr>
+        <w:tc>
+          <w:tcPr>
+            <w:tcW w:w="1875" w:type="dxa"/>
+            <w:shd w:val="clear" w:color="auto" w:fill="FFF2CC" w:themeFill="accent4" w:themeFillTint="33"/>
+          </w:tcPr>
+          <w:p>
+            <w:pPr>
+              <w:rPr>
+                <w:rFonts w:ascii="Calibri" w:eastAsia="Times New Roman" w:hAnsi="Calibri" w:cs="Calibri"/>
+                <w:color w:val="222222"/>
+                <w:lang w:bidi="mr-IN"/>
+              </w:rPr>
+            </w:pPr>
+            <w:r>
+              <w:rPr>
+                <w:rFonts w:ascii="Calibri" w:eastAsia="Times New Roman" w:hAnsi="Calibri" w:cs="Calibri"/>
+                <w:color w:val="000000"/>
+                <w:lang w:val="en-US" w:bidi="mr-IN"/>
+              </w:rPr>
+              <w:t>0</w:t>
+            </w:r>
+            <w:r>
+              <w:rPr>
+                <w:rFonts w:ascii="Calibri" w:eastAsia="Times New Roman" w:hAnsi="Calibri" w:cs="Calibri"/>
+                <w:color w:val="000000"/>
+                <w:lang w:val="en-US" w:bidi="mr-IN"/>
+              </w:rPr>
+              <w:t>2 N Shimla</w:t>
+            </w:r>
+          </w:p>
+        </w:tc>
+        <w:tc>
+          <w:tcPr>
+            <w:tcW w:w="1081" w:type="dxa"/>
+            <w:shd w:val="clear" w:color="auto" w:fill="FFF2CC" w:themeFill="accent4" w:themeFillTint="33"/>
+          </w:tcPr>
+          <w:p>
+            <w:pPr>
+              <w:rPr>
+                <w:rFonts w:eastAsia="Times New Roman" w:cstheme="minorHAnsi"/>
+                <w:color w:val="222222"/>
+                <w:lang w:eastAsia="en-IN" w:bidi="mr-IN"/>
+              </w:rPr>
+            </w:pPr>
+            <w:r>
+              <w:rPr>
+                <w:rFonts w:eastAsia="Times New Roman" w:cstheme="minorHAnsi"/>
+                <w:color w:val="222222"/>
+                <w:lang w:eastAsia="en-IN" w:bidi="mr-IN"/>
+              </w:rPr>
+              <w:t>11 Apr</w:t>
+            </w:r>
+          </w:p>
+        </w:tc>
+        <w:tc>
+          <w:tcPr>
+            <w:tcW w:w="1081" w:type="dxa"/>
+            <w:shd w:val="clear" w:color="auto" w:fill="FFF2CC" w:themeFill="accent4" w:themeFillTint="33"/>
+          </w:tcPr>
+          <w:p>
+            <w:pPr>
+              <w:rPr>
+                <w:rFonts w:eastAsia="Times New Roman" w:cstheme="minorHAnsi"/>
+                <w:color w:val="222222"/>
+                <w:lang w:eastAsia="en-IN" w:bidi="mr-IN"/>
+              </w:rPr>
+            </w:pPr>
+            <w:r>
+              <w:rPr>
+                <w:rFonts w:eastAsia="Times New Roman" w:cstheme="minorHAnsi"/>
+                <w:color w:val="222222"/>
+                <w:lang w:eastAsia="en-IN" w:bidi="mr-IN"/>
+              </w:rPr>
+              <w:t>13 Apr</w:t>
+            </w:r>
+          </w:p>
+        </w:tc>
+        <w:tc>
+          <w:tcPr>
+            <w:tcW w:w="1007" w:type="dxa"/>
+            <w:shd w:val="clear" w:color="auto" w:fill="FFF2CC" w:themeFill="accent4" w:themeFillTint="33"/>
+          </w:tcPr>
+          <w:p>
+            <w:pPr>
+              <w:rPr>
+                <w:rFonts w:eastAsia="Times New Roman" w:cstheme="minorHAnsi"/>
+                <w:color w:val="222222"/>
+                <w:lang w:eastAsia="en-IN" w:bidi="mr-IN"/>
+              </w:rPr>
+            </w:pPr>
+            <w:r>
+              <w:rPr>
+                <w:rFonts w:eastAsia="Times New Roman" w:cstheme="minorHAnsi"/>
+                <w:color w:val="222222"/>
+                <w:lang w:eastAsia="en-IN" w:bidi="mr-IN"/>
+              </w:rPr>
+              <w:t>03</w:t>
+            </w:r>
+          </w:p>
+        </w:tc>
+        <w:tc>
+          <w:tcPr>
+            <w:tcW w:w="1391" w:type="dxa"/>
+            <w:shd w:val="clear" w:color="auto" w:fill="FFF2CC" w:themeFill="accent4" w:themeFillTint="33"/>
+            <w:vAlign w:val="center"/>
+          </w:tcPr>
+          <w:p>
+            <w:pPr>
+              <w:rPr>
+                <w:rFonts w:eastAsia="Times New Roman" w:cstheme="minorHAnsi"/>
+                <w:color w:val="222222"/>
+                <w:lang w:eastAsia="en-IN" w:bidi="mr-IN"/>
+              </w:rPr>
+            </w:pPr>
+            <w:r>
+              <w:rPr>
+                <w:rFonts w:ascii="Calibri" w:eastAsia="Times New Roman" w:hAnsi="Calibri" w:cs="Calibri"/>
+                <w:color w:val="222222"/>
+                <w:lang w:bidi="mr-IN"/>
+              </w:rPr>
+              <w:t>0</w:t>
+            </w:r>
+            <w:r>
+              <w:rPr>
+                <w:rFonts w:ascii="Calibri" w:eastAsia="Times New Roman" w:hAnsi="Calibri" w:cs="Calibri"/>
+                <w:color w:val="222222"/>
+                <w:lang w:bidi="mr-IN"/>
+              </w:rPr>
+              <w:t>1 Room  with Extra Mattress</w:t>
+            </w:r>
+          </w:p>
+        </w:tc>
+        <w:tc>
+          <w:tcPr>
+            <w:tcW w:w="1389" w:type="dxa"/>
+            <w:shd w:val="clear" w:color="auto" w:fill="FFF2CC" w:themeFill="accent4" w:themeFillTint="33"/>
+            <w:vAlign w:val="center"/>
+          </w:tcPr>
+          <w:p>
+            <w:pPr>
+              <w:rPr>
+                <w:rFonts w:eastAsia="Times New Roman" w:cstheme="minorHAnsi"/>
+                <w:color w:val="222222"/>
+                <w:lang w:eastAsia="en-IN" w:bidi="mr-IN"/>
+              </w:rPr>
+            </w:pPr>
+            <w:r>
+              <w:rPr>
+                <w:rFonts w:ascii="Calibri" w:eastAsia="Times New Roman" w:hAnsi="Calibri" w:cs="Calibri"/>
+                <w:color w:val="222222"/>
+                <w:lang w:bidi="mr-IN"/>
+              </w:rPr>
+              <w:t>Breakfast and Dinner</w:t>
+            </w:r>
+          </w:p>
+        </w:tc>
+        <w:tc>
+          <w:tcPr>
+            <w:tcW w:w="1674" w:type="dxa"/>
+            <w:shd w:val="clear" w:color="auto" w:fill="FFF2CC" w:themeFill="accent4" w:themeFillTint="33"/>
+          </w:tcPr>
+          <w:p>
+            <w:pPr>
+              <w:rPr>
+                <w:rFonts w:eastAsia="Times New Roman" w:cstheme="minorHAnsi"/>
+                <w:color w:val="222222"/>
+                <w:lang w:eastAsia="en-IN" w:bidi="mr-IN"/>
+              </w:rPr>
+            </w:pPr>
+            <w:r>
+              <w:rPr>
+                <w:rFonts w:ascii="Calibri" w:eastAsia="Times New Roman" w:hAnsi="Calibri" w:cs="Calibri"/>
+                <w:color w:val="222222"/>
+                <w:lang w:bidi="mr-IN"/>
+              </w:rPr>
+              <w:t>SEDAN</w:t>
+            </w:r>
           </w:p>
         </w:tc>
       </w:tr>
     </w:tbl>
     <w:p>
       <w:pPr>
-        <w:shd w:val="clear" w:color="auto" w:fill="FFFFFF"/>
-        <w:spacing w:after="0" w:line="253" w:lineRule="atLeast"/>
-        <w:rPr>
-          <w:rFonts w:eastAsia="Times New Roman" w:cstheme="minorHAnsi"/>
-          <w:color w:val="222222"/>
-          <w:lang w:eastAsia="en-IN" w:bidi="mr-IN"/>
-        </w:rPr>
-      </w:pPr>
-    </w:p>
-    <w:tbl>
-      <w:tblPr>
-        <w:tblStyle w:val="TableGrid"/>
-        <w:tblW w:w="9237" w:type="dxa"/>
-        <w:jc w:val="center"/>
-        <w:tblLook w:val="04A0" w:firstRow="1" w:lastRow="0" w:firstColumn="1" w:lastColumn="0" w:noHBand="0" w:noVBand="1"/>
-      </w:tblPr>
-      <w:tblGrid>
-        <w:gridCol w:w="1644"/>
-        <w:gridCol w:w="3661"/>
-        <w:gridCol w:w="2419"/>
-        <w:gridCol w:w="1513"/>
-      </w:tblGrid>
-      <w:tr>
-        <w:trPr>
-          <w:trHeight w:val="159"/>
-          <w:jc w:val="center"/>
-        </w:trPr>
-        <w:tc>
-          <w:tcPr>
-            <w:tcW w:w="1644" w:type="dxa"/>
-            <w:shd w:val="clear" w:color="auto" w:fill="FFD966" w:themeFill="accent4" w:themeFillTint="99"/>
-          </w:tcPr>
-          <w:p>
-            <w:pPr>
-              <w:rPr>
-                <w:rFonts w:eastAsia="Times New Roman" w:cstheme="minorHAnsi"/>
-                <w:b/>
-                <w:bCs/>
-                <w:color w:val="222222"/>
-                <w:lang w:eastAsia="en-IN" w:bidi="mr-IN"/>
-              </w:rPr>
-            </w:pPr>
-            <w:r>
-              <w:rPr>
-                <w:rFonts w:eastAsia="Times New Roman" w:cstheme="minorHAnsi"/>
-                <w:b/>
-                <w:bCs/>
-                <w:color w:val="222222"/>
-                <w:lang w:eastAsia="en-IN" w:bidi="mr-IN"/>
-              </w:rPr>
-              <w:t>Train no</w:t>
-            </w:r>
-          </w:p>
-        </w:tc>
-        <w:tc>
-          <w:tcPr>
-            <w:tcW w:w="3661" w:type="dxa"/>
-            <w:shd w:val="clear" w:color="auto" w:fill="FFD966" w:themeFill="accent4" w:themeFillTint="99"/>
-          </w:tcPr>
-          <w:p>
-            <w:pPr>
-              <w:rPr>
-                <w:rFonts w:eastAsia="Times New Roman" w:cstheme="minorHAnsi"/>
-                <w:b/>
-                <w:bCs/>
-                <w:color w:val="222222"/>
-                <w:lang w:eastAsia="en-IN" w:bidi="mr-IN"/>
-              </w:rPr>
-            </w:pPr>
-            <w:r>
-              <w:rPr>
-                <w:rFonts w:eastAsia="Times New Roman" w:cstheme="minorHAnsi"/>
-                <w:b/>
-                <w:bCs/>
-                <w:color w:val="222222"/>
-                <w:lang w:eastAsia="en-IN" w:bidi="mr-IN"/>
-              </w:rPr>
-              <w:t>Train Name</w:t>
-            </w:r>
-          </w:p>
-        </w:tc>
-        <w:tc>
-          <w:tcPr>
-            <w:tcW w:w="2419" w:type="dxa"/>
-            <w:shd w:val="clear" w:color="auto" w:fill="FFD966" w:themeFill="accent4" w:themeFillTint="99"/>
-          </w:tcPr>
-          <w:p>
-            <w:pPr>
-              <w:rPr>
-                <w:rFonts w:eastAsia="Times New Roman" w:cstheme="minorHAnsi"/>
-                <w:b/>
-                <w:bCs/>
-                <w:color w:val="222222"/>
-                <w:lang w:eastAsia="en-IN" w:bidi="mr-IN"/>
-              </w:rPr>
-            </w:pPr>
-            <w:r>
-              <w:rPr>
-                <w:rFonts w:eastAsia="Times New Roman" w:cstheme="minorHAnsi"/>
-                <w:b/>
-                <w:bCs/>
-                <w:color w:val="222222"/>
-                <w:lang w:eastAsia="en-IN" w:bidi="mr-IN"/>
-              </w:rPr>
-              <w:t>Category</w:t>
-            </w:r>
-          </w:p>
-        </w:tc>
-        <w:tc>
-          <w:tcPr>
-            <w:tcW w:w="1513" w:type="dxa"/>
-            <w:shd w:val="clear" w:color="auto" w:fill="FFD966" w:themeFill="accent4" w:themeFillTint="99"/>
-          </w:tcPr>
-          <w:p>
-            <w:pPr>
-              <w:rPr>
-                <w:rFonts w:eastAsia="Times New Roman" w:cstheme="minorHAnsi"/>
-                <w:b/>
-                <w:bCs/>
-                <w:color w:val="222222"/>
-                <w:lang w:eastAsia="en-IN" w:bidi="mr-IN"/>
-              </w:rPr>
-            </w:pPr>
-            <w:r>
-              <w:rPr>
-                <w:rFonts w:eastAsia="Times New Roman" w:cstheme="minorHAnsi"/>
-                <w:b/>
-                <w:bCs/>
-                <w:color w:val="222222"/>
-                <w:lang w:eastAsia="en-IN" w:bidi="mr-IN"/>
-              </w:rPr>
-              <w:t>Meal</w:t>
-            </w:r>
-          </w:p>
-        </w:tc>
-      </w:tr>
-      <w:tr>
-        <w:trPr>
-          <w:trHeight w:val="368"/>
-          <w:jc w:val="center"/>
-        </w:trPr>
-        <w:tc>
-          <w:tcPr>
-            <w:tcW w:w="1644" w:type="dxa"/>
-            <w:shd w:val="clear" w:color="auto" w:fill="FFF2CC" w:themeFill="accent4" w:themeFillTint="33"/>
-          </w:tcPr>
-          <w:p>
-            <w:pPr>
-              <w:rPr>
-                <w:rFonts w:eastAsia="Times New Roman" w:cstheme="minorHAnsi"/>
-                <w:color w:val="222222"/>
-                <w:lang w:eastAsia="en-IN" w:bidi="mr-IN"/>
-              </w:rPr>
-            </w:pPr>
-          </w:p>
-        </w:tc>
-        <w:tc>
-          <w:tcPr>
-            <w:tcW w:w="3661" w:type="dxa"/>
-            <w:shd w:val="clear" w:color="auto" w:fill="FFF2CC" w:themeFill="accent4" w:themeFillTint="33"/>
-          </w:tcPr>
-          <w:p>
-            <w:pPr>
-              <w:rPr>
-                <w:rFonts w:eastAsia="Times New Roman" w:cstheme="minorHAnsi"/>
-                <w:color w:val="222222"/>
-                <w:lang w:eastAsia="en-IN" w:bidi="mr-IN"/>
-              </w:rPr>
-            </w:pPr>
-          </w:p>
-        </w:tc>
-        <w:tc>
-          <w:tcPr>
-            <w:tcW w:w="2419" w:type="dxa"/>
-            <w:shd w:val="clear" w:color="auto" w:fill="FFF2CC" w:themeFill="accent4" w:themeFillTint="33"/>
-          </w:tcPr>
-          <w:p>
-            <w:pPr>
-              <w:rPr>
-                <w:rFonts w:eastAsia="Times New Roman" w:cstheme="minorHAnsi"/>
-                <w:color w:val="222222"/>
-                <w:lang w:eastAsia="en-IN" w:bidi="mr-IN"/>
-              </w:rPr>
-            </w:pPr>
-          </w:p>
-        </w:tc>
-        <w:tc>
-          <w:tcPr>
-            <w:tcW w:w="1513" w:type="dxa"/>
-            <w:shd w:val="clear" w:color="auto" w:fill="FFF2CC" w:themeFill="accent4" w:themeFillTint="33"/>
-          </w:tcPr>
-          <w:p>
-            <w:pPr>
-              <w:rPr>
-                <w:rFonts w:eastAsia="Times New Roman" w:cstheme="minorHAnsi"/>
-                <w:color w:val="222222"/>
-                <w:lang w:eastAsia="en-IN" w:bidi="mr-IN"/>
-              </w:rPr>
-            </w:pPr>
-          </w:p>
-        </w:tc>
-      </w:tr>
-      <w:tr>
-        <w:trPr>
-          <w:trHeight w:val="368"/>
-          <w:jc w:val="center"/>
-        </w:trPr>
-        <w:tc>
-          <w:tcPr>
-            <w:tcW w:w="1644" w:type="dxa"/>
-            <w:shd w:val="clear" w:color="auto" w:fill="FFF2CC" w:themeFill="accent4" w:themeFillTint="33"/>
-          </w:tcPr>
-          <w:p>
-            <w:pPr>
-              <w:rPr>
-                <w:rFonts w:eastAsia="Times New Roman" w:cstheme="minorHAnsi"/>
-                <w:color w:val="222222"/>
-                <w:lang w:eastAsia="en-IN" w:bidi="mr-IN"/>
-              </w:rPr>
-            </w:pPr>
-          </w:p>
-        </w:tc>
-        <w:tc>
-          <w:tcPr>
-            <w:tcW w:w="3661" w:type="dxa"/>
-            <w:shd w:val="clear" w:color="auto" w:fill="FFF2CC" w:themeFill="accent4" w:themeFillTint="33"/>
-          </w:tcPr>
-          <w:p>
-            <w:pPr>
-              <w:rPr>
-                <w:rFonts w:eastAsia="Times New Roman" w:cstheme="minorHAnsi"/>
-                <w:color w:val="222222"/>
-                <w:lang w:eastAsia="en-IN" w:bidi="mr-IN"/>
-              </w:rPr>
-            </w:pPr>
-          </w:p>
-        </w:tc>
-        <w:tc>
-          <w:tcPr>
-            <w:tcW w:w="2419" w:type="dxa"/>
-            <w:shd w:val="clear" w:color="auto" w:fill="FFF2CC" w:themeFill="accent4" w:themeFillTint="33"/>
-          </w:tcPr>
-          <w:p>
-            <w:pPr>
-              <w:rPr>
-                <w:rFonts w:eastAsia="Times New Roman" w:cstheme="minorHAnsi"/>
-                <w:color w:val="222222"/>
-                <w:lang w:eastAsia="en-IN" w:bidi="mr-IN"/>
-              </w:rPr>
-            </w:pPr>
-          </w:p>
-        </w:tc>
-        <w:tc>
-          <w:tcPr>
-            <w:tcW w:w="1513" w:type="dxa"/>
-            <w:shd w:val="clear" w:color="auto" w:fill="FFF2CC" w:themeFill="accent4" w:themeFillTint="33"/>
-          </w:tcPr>
-          <w:p>
-            <w:pPr>
-              <w:rPr>
-                <w:rFonts w:eastAsia="Times New Roman" w:cstheme="minorHAnsi"/>
-                <w:color w:val="222222"/>
-                <w:lang w:eastAsia="en-IN" w:bidi="mr-IN"/>
-              </w:rPr>
-            </w:pPr>
-          </w:p>
-        </w:tc>
-      </w:tr>
-      <w:tr>
-        <w:trPr>
-          <w:trHeight w:val="368"/>
-          <w:jc w:val="center"/>
-        </w:trPr>
-        <w:tc>
-          <w:tcPr>
-            <w:tcW w:w="1644" w:type="dxa"/>
-            <w:shd w:val="clear" w:color="auto" w:fill="FFF2CC" w:themeFill="accent4" w:themeFillTint="33"/>
-          </w:tcPr>
-          <w:p>
-            <w:pPr>
-              <w:rPr>
-                <w:rFonts w:eastAsia="Times New Roman" w:cstheme="minorHAnsi"/>
-                <w:color w:val="222222"/>
-                <w:lang w:eastAsia="en-IN" w:bidi="mr-IN"/>
-              </w:rPr>
-            </w:pPr>
-          </w:p>
-        </w:tc>
-        <w:tc>
-          <w:tcPr>
-            <w:tcW w:w="3661" w:type="dxa"/>
-            <w:shd w:val="clear" w:color="auto" w:fill="FFF2CC" w:themeFill="accent4" w:themeFillTint="33"/>
-          </w:tcPr>
-          <w:p>
-            <w:pPr>
-              <w:rPr>
-                <w:rFonts w:eastAsia="Times New Roman" w:cstheme="minorHAnsi"/>
-                <w:color w:val="222222"/>
-                <w:lang w:eastAsia="en-IN" w:bidi="mr-IN"/>
-              </w:rPr>
-            </w:pPr>
-          </w:p>
-        </w:tc>
-        <w:tc>
-          <w:tcPr>
-            <w:tcW w:w="2419" w:type="dxa"/>
-            <w:shd w:val="clear" w:color="auto" w:fill="FFF2CC" w:themeFill="accent4" w:themeFillTint="33"/>
-          </w:tcPr>
-          <w:p>
-            <w:pPr>
-              <w:rPr>
-                <w:rFonts w:eastAsia="Times New Roman" w:cstheme="minorHAnsi"/>
-                <w:color w:val="222222"/>
-                <w:lang w:eastAsia="en-IN" w:bidi="mr-IN"/>
-              </w:rPr>
-            </w:pPr>
-          </w:p>
-        </w:tc>
-        <w:tc>
-          <w:tcPr>
-            <w:tcW w:w="1513" w:type="dxa"/>
-            <w:shd w:val="clear" w:color="auto" w:fill="FFF2CC" w:themeFill="accent4" w:themeFillTint="33"/>
-          </w:tcPr>
-          <w:p>
-            <w:pPr>
-              <w:rPr>
-                <w:rFonts w:eastAsia="Times New Roman" w:cstheme="minorHAnsi"/>
-                <w:color w:val="222222"/>
-                <w:lang w:eastAsia="en-IN" w:bidi="mr-IN"/>
-              </w:rPr>
-            </w:pPr>
-          </w:p>
-        </w:tc>
-      </w:tr>
-      <w:tr>
-        <w:trPr>
-          <w:trHeight w:val="368"/>
-          <w:jc w:val="center"/>
-        </w:trPr>
-        <w:tc>
-          <w:tcPr>
-            <w:tcW w:w="1644" w:type="dxa"/>
-            <w:shd w:val="clear" w:color="auto" w:fill="FFF2CC" w:themeFill="accent4" w:themeFillTint="33"/>
-          </w:tcPr>
-          <w:p>
-            <w:pPr>
-              <w:rPr>
-                <w:rFonts w:eastAsia="Times New Roman" w:cstheme="minorHAnsi"/>
-                <w:color w:val="222222"/>
-                <w:lang w:eastAsia="en-IN" w:bidi="mr-IN"/>
-              </w:rPr>
-            </w:pPr>
-          </w:p>
-        </w:tc>
-        <w:tc>
-          <w:tcPr>
-            <w:tcW w:w="3661" w:type="dxa"/>
-            <w:shd w:val="clear" w:color="auto" w:fill="FFF2CC" w:themeFill="accent4" w:themeFillTint="33"/>
-          </w:tcPr>
-          <w:p>
-            <w:pPr>
-              <w:rPr>
-                <w:rFonts w:eastAsia="Times New Roman" w:cstheme="minorHAnsi"/>
-                <w:color w:val="222222"/>
-                <w:lang w:eastAsia="en-IN" w:bidi="mr-IN"/>
-              </w:rPr>
-            </w:pPr>
-          </w:p>
-        </w:tc>
-        <w:tc>
-          <w:tcPr>
-            <w:tcW w:w="2419" w:type="dxa"/>
-            <w:shd w:val="clear" w:color="auto" w:fill="FFF2CC" w:themeFill="accent4" w:themeFillTint="33"/>
-          </w:tcPr>
-          <w:p>
-            <w:pPr>
-              <w:rPr>
-                <w:rFonts w:eastAsia="Times New Roman" w:cstheme="minorHAnsi"/>
-                <w:color w:val="222222"/>
-                <w:lang w:eastAsia="en-IN" w:bidi="mr-IN"/>
-              </w:rPr>
-            </w:pPr>
-          </w:p>
-        </w:tc>
-        <w:tc>
-          <w:tcPr>
-            <w:tcW w:w="1513" w:type="dxa"/>
-            <w:shd w:val="clear" w:color="auto" w:fill="FFF2CC" w:themeFill="accent4" w:themeFillTint="33"/>
-          </w:tcPr>
-          <w:p>
-            <w:pPr>
-              <w:rPr>
-                <w:rFonts w:eastAsia="Times New Roman" w:cstheme="minorHAnsi"/>
-                <w:color w:val="222222"/>
-                <w:lang w:eastAsia="en-IN" w:bidi="mr-IN"/>
-              </w:rPr>
-            </w:pPr>
-          </w:p>
-        </w:tc>
-      </w:tr>
-    </w:tbl>
-    <w:p>
-      <w:pPr>
-        <w:shd w:val="clear" w:color="auto" w:fill="FFFFFF"/>
-        <w:spacing w:after="0" w:line="253" w:lineRule="atLeast"/>
-        <w:rPr>
-          <w:rFonts w:eastAsia="Times New Roman" w:cstheme="minorHAnsi"/>
-          <w:color w:val="222222"/>
-          <w:lang w:eastAsia="en-IN" w:bidi="mr-IN"/>
-        </w:rPr>
-      </w:pPr>
-    </w:p>
-    <w:p>
-      <w:pPr>
-        <w:rPr>
-          <w:rFonts w:asciiTheme="majorHAnsi" w:eastAsiaTheme="majorEastAsia" w:hAnsiTheme="majorHAnsi" w:cstheme="majorBidi"/>
+        <w:rPr>
           <w:b/>
           <w:bCs/>
           <w:sz w:val="32"/>
@@ -1086,6 +1361,18 @@
         </w:rPr>
         <w:br w:type="page"/>
       </w:r>
+    </w:p>
+    <w:p>
+      <w:pPr>
+        <w:rPr>
+          <w:b/>
+          <w:bCs/>
+          <w:sz w:val="32"/>
+          <w:szCs w:val="32"/>
+          <w:u w:val="single"/>
+          <w:lang w:val="en-US"/>
+        </w:rPr>
+      </w:pPr>
     </w:p>
     <w:p>
       <w:pPr>
@@ -1101,7 +1388,6 @@
           <w:lang w:val="en-US"/>
         </w:rPr>
       </w:pPr>
-      <w:proofErr w:type="spellStart"/>
       <w:r>
         <w:rPr>
           <w:b/>
@@ -1112,22 +1398,10 @@
           <w:u w:val="single"/>
           <w:lang w:val="en-US"/>
         </w:rPr>
-        <w:lastRenderedPageBreak/>
-        <w:t>Daywise</w:t>
+        <w:t>Day wise Itinerary</w:t>
       </w:r>
-      <w:proofErr w:type="spellEnd"/>
-      <w:r>
-        <w:rPr>
-          <w:b/>
-          <w:bCs/>
-          <w:color w:val="auto"/>
-          <w:sz w:val="32"/>
-          <w:szCs w:val="32"/>
-          <w:u w:val="single"/>
-          <w:lang w:val="en-US"/>
-        </w:rPr>
-        <w:t xml:space="preserve"> Itinerary</w:t>
-      </w:r>
+      <w:bookmarkStart w:id="0" w:name="_GoBack"/>
+      <w:bookmarkEnd w:id="0"/>
     </w:p>
     <w:p>
       <w:pPr>
@@ -1237,55 +1511,46 @@
             </w:r>
             <w:proofErr w:type="spellEnd"/>
             <w:r>
-              <w:t xml:space="preserve">, get ready to hit the road to Dalhousie - a famous hill station and unique summer retreat </w:t>
-            </w:r>
-            <w:proofErr w:type="spellStart"/>
-            <w:r>
-              <w:t>inHimachal</w:t>
-            </w:r>
-            <w:proofErr w:type="spellEnd"/>
-            <w:r>
-              <w:t xml:space="preserve">. Watch for curious painted rock carvings of Buddhist deities along the south side of the ridge. </w:t>
-            </w:r>
-            <w:proofErr w:type="spellStart"/>
-            <w:r>
-              <w:t>Theravishing</w:t>
-            </w:r>
-            <w:proofErr w:type="spellEnd"/>
-            <w:r>
-              <w:t xml:space="preserve"> rhododendrons, gorgeous greens and pristine air add to the beauty of Dalhousie. Quite a few </w:t>
-            </w:r>
-            <w:proofErr w:type="spellStart"/>
-            <w:r>
-              <w:t>Tibetanrefugees</w:t>
-            </w:r>
-            <w:proofErr w:type="spellEnd"/>
-            <w:r>
-              <w:t xml:space="preserve"> have made a home in Dalhousie as well. You can also choose to visit the British-era churches of St </w:t>
-            </w:r>
-            <w:proofErr w:type="gramStart"/>
-            <w:r>
-              <w:t>John(</w:t>
-            </w:r>
-            <w:proofErr w:type="gramEnd"/>
-            <w:r>
-              <w:t xml:space="preserve">1863) and St Francis (1894) or wander around the market areas of </w:t>
-            </w:r>
-            <w:proofErr w:type="spellStart"/>
-            <w:r>
-              <w:t>Subhash</w:t>
-            </w:r>
-            <w:proofErr w:type="spellEnd"/>
-            <w:r>
-              <w:t xml:space="preserve"> Chowk and Gandhi Chowk. Upon </w:t>
-            </w:r>
-            <w:proofErr w:type="spellStart"/>
-            <w:r>
-              <w:t>arrivalat</w:t>
-            </w:r>
-            <w:proofErr w:type="spellEnd"/>
-            <w:r>
-              <w:t xml:space="preserve"> hotel, check in and relax. Your evening is free for leisure activities. </w:t>
+              <w:t>, get ready to hit the road to Dalhousie - a famous hill station and unique summer retreat in</w:t>
+            </w:r>
+            <w:r>
+              <w:t xml:space="preserve"> </w:t>
+            </w:r>
+            <w:r>
+              <w:t>Himachal. Watch for curious painted rock carvings of Buddhist deities along the south side of the ridge. The</w:t>
+            </w:r>
+            <w:r>
+              <w:t xml:space="preserve"> </w:t>
+            </w:r>
+            <w:r>
+              <w:t xml:space="preserve">ravishing rhododendrons, gorgeous greens and pristine air add to the beauty of </w:t>
+            </w:r>
+            <w:r>
+              <w:rPr>
+                <w:b/>
+                <w:bCs/>
+              </w:rPr>
+              <w:t>Dalhousie</w:t>
+            </w:r>
+            <w:r>
+              <w:t>. Quite a few Tibetan</w:t>
+            </w:r>
+            <w:r>
+              <w:t xml:space="preserve"> </w:t>
+            </w:r>
+            <w:r>
+              <w:t xml:space="preserve">refugees have made a home in Dalhousie as well. </w:t>
+            </w:r>
+          </w:p>
+          <w:p>
+            <w:r>
+              <w:t>Upon arrival</w:t>
+            </w:r>
+            <w:r>
+              <w:t xml:space="preserve"> </w:t>
+            </w:r>
+            <w:r>
+              <w:t>at hotel, check in and relax.</w:t>
             </w:r>
           </w:p>
           <w:p>
@@ -1405,6 +1670,10 @@
             </w:r>
             <w:proofErr w:type="spellStart"/>
             <w:r>
+              <w:rPr>
+                <w:b/>
+                <w:bCs/>
+              </w:rPr>
               <w:t>Khajjiar</w:t>
             </w:r>
             <w:proofErr w:type="spellEnd"/>
@@ -1417,23 +1686,19 @@
             </w:r>
             <w:proofErr w:type="spellEnd"/>
             <w:r>
-              <w:t xml:space="preserve"> from Dalhousie) -India's Switzerland. This unmistakably scenic saucer shaped plateau </w:t>
-            </w:r>
-            <w:proofErr w:type="spellStart"/>
-            <w:r>
-              <w:t>issurrounded</w:t>
-            </w:r>
-            <w:proofErr w:type="spellEnd"/>
-            <w:r>
-              <w:t xml:space="preserve"> by dense pine and thick forests of deodar along the fringes of </w:t>
-            </w:r>
-            <w:proofErr w:type="spellStart"/>
-            <w:r>
-              <w:t>theexquisite</w:t>
-            </w:r>
-            <w:proofErr w:type="spellEnd"/>
-            <w:r>
-              <w:t xml:space="preserve"> glade of </w:t>
+              <w:t xml:space="preserve"> from Dalhousie) -India's Switzerland. This unmistakably scenic saucer shaped plateau is</w:t>
+            </w:r>
+            <w:r>
+              <w:t xml:space="preserve"> </w:t>
+            </w:r>
+            <w:r>
+              <w:t>surrounded by dense pine and thick forests of deodar along the fringes of the</w:t>
+            </w:r>
+            <w:r>
+              <w:t xml:space="preserve"> </w:t>
+            </w:r>
+            <w:r>
+              <w:t xml:space="preserve">exquisite glade of </w:t>
             </w:r>
             <w:proofErr w:type="spellStart"/>
             <w:r>
@@ -1441,23 +1706,19 @@
             </w:r>
             <w:proofErr w:type="spellEnd"/>
             <w:r>
-              <w:t xml:space="preserve"> (1085 m). Horse riding and zorbing are two very </w:t>
-            </w:r>
-            <w:proofErr w:type="spellStart"/>
-            <w:r>
-              <w:t>funthings</w:t>
-            </w:r>
-            <w:proofErr w:type="spellEnd"/>
-            <w:r>
-              <w:t xml:space="preserve"> to do here. When you are out sightseeing, take the time to step in to </w:t>
-            </w:r>
-            <w:proofErr w:type="spellStart"/>
-            <w:r>
-              <w:t>atemple</w:t>
-            </w:r>
-            <w:proofErr w:type="spellEnd"/>
-            <w:r>
-              <w:t xml:space="preserve"> dedicated to </w:t>
+              <w:t xml:space="preserve"> (1085 m). Horse riding and zorbing are two very fun</w:t>
+            </w:r>
+            <w:r>
+              <w:t xml:space="preserve"> </w:t>
+            </w:r>
+            <w:r>
+              <w:t>things to do here. When you are out sightseeing, take the time to step in to a</w:t>
+            </w:r>
+            <w:r>
+              <w:t xml:space="preserve"> </w:t>
+            </w:r>
+            <w:r>
+              <w:t xml:space="preserve">temple dedicated to </w:t>
             </w:r>
             <w:proofErr w:type="spellStart"/>
             <w:r>
@@ -1465,23 +1726,19 @@
             </w:r>
             <w:proofErr w:type="spellEnd"/>
             <w:r>
-              <w:t xml:space="preserve"> Nag. Behold snake idols here, as it is a 12th </w:t>
-            </w:r>
-            <w:proofErr w:type="spellStart"/>
-            <w:r>
-              <w:t>centuryAD</w:t>
-            </w:r>
-            <w:proofErr w:type="spellEnd"/>
-            <w:r>
-              <w:t xml:space="preserve"> temple dedicated to Naga, the lord of serpents. Within the temple are life </w:t>
-            </w:r>
-            <w:proofErr w:type="spellStart"/>
-            <w:r>
-              <w:t>sizewooden</w:t>
-            </w:r>
-            <w:proofErr w:type="spellEnd"/>
-            <w:r>
-              <w:t xml:space="preserve"> images of the five </w:t>
+              <w:t xml:space="preserve"> Nag. Behold snake idols here, as it is a 12th century</w:t>
+            </w:r>
+            <w:r>
+              <w:t xml:space="preserve"> </w:t>
+            </w:r>
+            <w:r>
+              <w:t>AD temple dedicated to Naga, the lord of serpents. Within the temple are life size</w:t>
+            </w:r>
+            <w:r>
+              <w:t xml:space="preserve"> </w:t>
+            </w:r>
+            <w:r>
+              <w:t xml:space="preserve">wooden images of the five </w:t>
             </w:r>
             <w:proofErr w:type="spellStart"/>
             <w:r>
@@ -1498,6 +1755,10 @@
             </w:r>
             <w:proofErr w:type="spellStart"/>
             <w:r>
+              <w:rPr>
+                <w:b/>
+                <w:bCs/>
+              </w:rPr>
               <w:t>Chamba</w:t>
             </w:r>
             <w:proofErr w:type="spellEnd"/>
@@ -1518,15 +1779,13 @@
             </w:r>
             <w:proofErr w:type="spellEnd"/>
             <w:r>
-              <w:t xml:space="preserve">) and </w:t>
-            </w:r>
-            <w:proofErr w:type="spellStart"/>
-            <w:r>
-              <w:t>afterexploring</w:t>
-            </w:r>
-            <w:proofErr w:type="spellEnd"/>
-            <w:r>
-              <w:t xml:space="preserve"> the sights, get back to Dalhousie. </w:t>
+              <w:t>) and after</w:t>
+            </w:r>
+            <w:r>
+              <w:t xml:space="preserve"> </w:t>
+            </w:r>
+            <w:r>
+              <w:t xml:space="preserve">exploring the sights, get back to Dalhousie. </w:t>
             </w:r>
           </w:p>
           <w:p>
@@ -1666,47 +1925,159 @@
             </w:r>
             <w:proofErr w:type="spellEnd"/>
             <w:r>
-              <w:t xml:space="preserve"> mountain ranges, lush pine &amp; deodar forests, fresh clean air and all kinds of fun for a winter holiday. </w:t>
-            </w:r>
-          </w:p>
-          <w:p>
-            <w:r>
-              <w:t xml:space="preserve">On arrival, check-in at the hotel. Later embark on a sightseeing visit to the famous Tibetan Medical Centre, where treatment is done using rare Tibetan medicines. </w:t>
-            </w:r>
-          </w:p>
-          <w:p>
-            <w:r>
-              <w:t xml:space="preserve">St. John Church, which is one of the oldest churches of this region. It is widely acknowledged for its Belgian stained-glass windows, which were donated by Lady Elgin. Other than these attractions, some other places to visit include </w:t>
-            </w:r>
-            <w:proofErr w:type="spellStart"/>
-            <w:r>
-              <w:t>Kangra</w:t>
-            </w:r>
-            <w:proofErr w:type="spellEnd"/>
-            <w:r>
-              <w:t xml:space="preserve"> Art Museum, Tea Gardens and </w:t>
-            </w:r>
-            <w:proofErr w:type="spellStart"/>
-            <w:r>
-              <w:t>Kunal</w:t>
-            </w:r>
-            <w:proofErr w:type="spellEnd"/>
+              <w:t xml:space="preserve"> mountain ranges, lush pine &amp; deodar forests, fresh clean air and all kin</w:t>
+            </w:r>
+            <w:r>
+              <w:t>ds of fun for a winter holiday.</w:t>
+            </w:r>
+          </w:p>
+          <w:p/>
+          <w:p>
+            <w:r>
+              <w:rPr>
+                <w:b/>
+                <w:bCs/>
+              </w:rPr>
+              <w:t xml:space="preserve">McLeod </w:t>
+            </w:r>
+            <w:proofErr w:type="spellStart"/>
+            <w:r>
+              <w:rPr>
+                <w:b/>
+                <w:bCs/>
+              </w:rPr>
+              <w:t>Ganj</w:t>
+            </w:r>
+            <w:proofErr w:type="spellEnd"/>
+            <w:r>
+              <w:t xml:space="preserve"> Known as "Little Lhasa" due to its strong Tibetan influence. A lively area with cafes, Tibetan markets, and monasteries.</w:t>
+            </w:r>
+          </w:p>
+          <w:p/>
+          <w:p>
+            <w:proofErr w:type="spellStart"/>
+            <w:r>
+              <w:rPr>
+                <w:b/>
+                <w:bCs/>
+              </w:rPr>
+              <w:t>Bhagsu</w:t>
+            </w:r>
+            <w:proofErr w:type="spellEnd"/>
+            <w:r>
+              <w:rPr>
+                <w:b/>
+                <w:bCs/>
+              </w:rPr>
+              <w:t xml:space="preserve"> Waterfall &amp; </w:t>
+            </w:r>
+            <w:proofErr w:type="spellStart"/>
+            <w:r>
+              <w:rPr>
+                <w:b/>
+                <w:bCs/>
+              </w:rPr>
+              <w:t>Bhagsunag</w:t>
+            </w:r>
+            <w:proofErr w:type="spellEnd"/>
+            <w:r>
+              <w:rPr>
+                <w:b/>
+                <w:bCs/>
+              </w:rPr>
+              <w:t xml:space="preserve"> Temple</w:t>
+            </w:r>
+            <w:r>
+              <w:t xml:space="preserve"> A scenic waterfall, about 20 meters high, perfect for trekking and photography. The </w:t>
+            </w:r>
+            <w:proofErr w:type="spellStart"/>
+            <w:r>
+              <w:t>Bhagsunag</w:t>
+            </w:r>
+            <w:proofErr w:type="spellEnd"/>
+            <w:r>
+              <w:t xml:space="preserve"> Temple, dedicated to Lord Shiva, is nearby.</w:t>
+            </w:r>
+          </w:p>
+          <w:p/>
+          <w:p>
+            <w:r>
+              <w:rPr>
+                <w:b/>
+                <w:bCs/>
+              </w:rPr>
+              <w:t>Dal Lake</w:t>
+            </w:r>
+            <w:r>
+              <w:t xml:space="preserve"> A serene lake surrounded by deodar forests. Named after the Dal Lake in Srinagar, with a small Shiva temple nearby.</w:t>
+            </w:r>
+          </w:p>
+          <w:p/>
+          <w:p>
+            <w:r>
+              <w:rPr>
+                <w:rStyle w:val="Strong"/>
+              </w:rPr>
+              <w:t>HPCA Cricket Stadium</w:t>
+            </w:r>
+            <w:r>
+              <w:t xml:space="preserve"> in </w:t>
+            </w:r>
+            <w:proofErr w:type="spellStart"/>
+            <w:r>
+              <w:t>Dharamshala</w:t>
+            </w:r>
+            <w:proofErr w:type="spellEnd"/>
+            <w:r>
+              <w:t xml:space="preserve"> is one of the most beautiful cricket stadiums in the world.</w:t>
+            </w:r>
             <w:r>
               <w:t xml:space="preserve"> </w:t>
             </w:r>
-            <w:proofErr w:type="spellStart"/>
-            <w:r>
-              <w:t>Pathri</w:t>
-            </w:r>
-            <w:proofErr w:type="spellEnd"/>
-            <w:r>
-              <w:t xml:space="preserve"> Temple. </w:t>
-            </w:r>
+            <w:r>
+              <w:t>Open to visitors when no matches are scheduled</w:t>
+            </w:r>
+            <w:r>
+              <w:t>.</w:t>
+            </w:r>
+          </w:p>
+          <w:p/>
+          <w:p>
+            <w:r>
+              <w:t>V</w:t>
+            </w:r>
+            <w:r>
+              <w:t xml:space="preserve">isit to the famous Tibetan Medical Centre, where treatment is done using rare Tibetan medicines. </w:t>
+            </w:r>
+          </w:p>
+          <w:p>
+            <w:r>
+              <w:t xml:space="preserve">St. John Church, which is one of the oldest churches of this region. It is widely acknowledged for its Belgian stained-glass windows, which were donated by Lady Elgin. </w:t>
+            </w:r>
+          </w:p>
+          <w:p/>
+          <w:p>
+            <w:r>
+              <w:t xml:space="preserve">On arrival, check-in at the hotel. </w:t>
+            </w:r>
+          </w:p>
+          <w:p>
             <w:r>
               <w:t>Dinner and Overnight stay</w:t>
             </w:r>
             <w:r>
-              <w:t xml:space="preserve"> at Hotel.</w:t>
+              <w:t xml:space="preserve"> at Hotel</w:t>
+            </w:r>
+            <w:r>
+              <w:t xml:space="preserve"> in </w:t>
+            </w:r>
+            <w:proofErr w:type="spellStart"/>
+            <w:r>
+              <w:t>Dharmshala</w:t>
+            </w:r>
+            <w:proofErr w:type="spellEnd"/>
+            <w:r>
+              <w:t>.</w:t>
             </w:r>
           </w:p>
         </w:tc>
@@ -1916,6 +2287,22 @@
               </w:rPr>
               <w:t>: </w:t>
             </w:r>
+            <w:proofErr w:type="spellStart"/>
+            <w:r>
+              <w:rPr>
+                <w:b/>
+                <w:bCs/>
+              </w:rPr>
+              <w:t>Manali</w:t>
+            </w:r>
+            <w:proofErr w:type="spellEnd"/>
+            <w:r>
+              <w:rPr>
+                <w:b/>
+                <w:bCs/>
+              </w:rPr>
+              <w:t xml:space="preserve"> </w:t>
+            </w:r>
             <w:r>
               <w:rPr>
                 <w:b/>
@@ -1970,65 +2357,127 @@
             </w:r>
             <w:proofErr w:type="spellEnd"/>
             <w:r>
+              <w:t xml:space="preserve"> above</w:t>
+            </w:r>
+            <w:r>
               <w:t xml:space="preserve"> </w:t>
             </w:r>
-            <w:proofErr w:type="spellStart"/>
-            <w:r>
-              <w:t>abovemean</w:t>
-            </w:r>
-            <w:proofErr w:type="spellEnd"/>
-            <w:r>
-              <w:t xml:space="preserve"> sea level, the preferred location for adventure activities in Himachal </w:t>
-            </w:r>
-            <w:proofErr w:type="spellStart"/>
-            <w:r>
-              <w:t>Pradesh</w:t>
+            <w:r>
+              <w:t>mean sea level, the preferred location for adventure activities in Himachal Pradesh,</w:t>
+            </w:r>
+            <w:r>
+              <w:t xml:space="preserve"> </w:t>
+            </w:r>
+            <w:proofErr w:type="spellStart"/>
+            <w:r>
+              <w:rPr>
+                <w:b/>
+                <w:bCs/>
+              </w:rPr>
+              <w:t>Solang</w:t>
+            </w:r>
+            <w:proofErr w:type="spellEnd"/>
+            <w:r>
+              <w:rPr>
+                <w:b/>
+                <w:bCs/>
+              </w:rPr>
+              <w:t xml:space="preserve"> Valley</w:t>
+            </w:r>
+            <w:r>
+              <w:t xml:space="preserve"> is a must-see for adrenaline junkies. You can choose to go parachuting</w:t>
+            </w:r>
+            <w:r>
+              <w:t xml:space="preserve"> </w:t>
+            </w:r>
+            <w:r>
+              <w:t>paragliding, skating or zorbing (at own expense). Its lush forests, apple orchards,</w:t>
+            </w:r>
+            <w:r>
+              <w:t xml:space="preserve"> </w:t>
+            </w:r>
+            <w:proofErr w:type="spellStart"/>
+            <w:r>
+              <w:t>snow</w:t>
+            </w:r>
+            <w:r>
+              <w:t xml:space="preserve"> </w:t>
+            </w:r>
+            <w:r>
+              <w:t>capped</w:t>
+            </w:r>
+            <w:proofErr w:type="spellEnd"/>
+            <w:r>
+              <w:t xml:space="preserve"> peaks and rivers attract visitors as well. Also halt at Nehru </w:t>
+            </w:r>
+            <w:proofErr w:type="spellStart"/>
+            <w:r>
+              <w:t>Kund</w:t>
+            </w:r>
+            <w:proofErr w:type="spellEnd"/>
+            <w:r>
+              <w:t>. Then</w:t>
+            </w:r>
+            <w:r>
+              <w:t xml:space="preserve"> </w:t>
+            </w:r>
+            <w:r>
+              <w:t xml:space="preserve">proceed towards </w:t>
+            </w:r>
+            <w:r>
+              <w:rPr>
+                <w:b/>
+                <w:bCs/>
+              </w:rPr>
+              <w:t>Atal Tunnel</w:t>
+            </w:r>
+            <w:r>
+              <w:t xml:space="preserve">. Atal tunnel starts from </w:t>
+            </w:r>
+            <w:proofErr w:type="spellStart"/>
+            <w:r>
+              <w:t>Solang</w:t>
+            </w:r>
+            <w:proofErr w:type="spellEnd"/>
+            <w:r>
+              <w:t xml:space="preserve">, and the total distance </w:t>
+            </w:r>
+            <w:proofErr w:type="spellStart"/>
+            <w:r>
+              <w:t>oftunnel</w:t>
+            </w:r>
+            <w:proofErr w:type="spellEnd"/>
+            <w:r>
+              <w:t xml:space="preserve"> is 17 </w:t>
+            </w:r>
+            <w:proofErr w:type="spellStart"/>
+            <w:r>
+              <w:t>kms</w:t>
+            </w:r>
+            <w:proofErr w:type="spellEnd"/>
+            <w:r>
+              <w:t xml:space="preserve"> one way and takes 1hr 15 min one way and tunnel ends at a place</w:t>
+            </w:r>
+            <w:r>
+              <w:t xml:space="preserve"> </w:t>
+            </w:r>
+            <w:r>
+              <w:t xml:space="preserve">called </w:t>
             </w:r>
             <w:proofErr w:type="gramStart"/>
             <w:r>
-              <w:t>,Solang</w:t>
-            </w:r>
-            <w:proofErr w:type="spellEnd"/>
+              <w:rPr>
+                <w:b/>
+                <w:bCs/>
+              </w:rPr>
+              <w:t>SISSU</w:t>
+            </w:r>
+            <w:r>
+              <w:t xml:space="preserve"> .</w:t>
+            </w:r>
             <w:proofErr w:type="gramEnd"/>
             <w:r>
-              <w:t xml:space="preserve"> Valley is a must-see for adrenaline junkies. You can choose to go </w:t>
-            </w:r>
-            <w:proofErr w:type="spellStart"/>
-            <w:r>
-              <w:t>parachutingparagliding</w:t>
-            </w:r>
-            <w:proofErr w:type="spellEnd"/>
-            <w:r>
-              <w:t xml:space="preserve">, skating or zorbing (at own expense). Its lush forests, apple </w:t>
-            </w:r>
-            <w:proofErr w:type="spellStart"/>
-            <w:r>
-              <w:t>orchards</w:t>
-            </w:r>
-            <w:proofErr w:type="gramStart"/>
-            <w:r>
-              <w:t>,snowcapped</w:t>
-            </w:r>
-            <w:proofErr w:type="spellEnd"/>
-            <w:proofErr w:type="gramEnd"/>
-            <w:r>
-              <w:t xml:space="preserve"> peaks and rivers attract visitors as well. Also halt at Nehru </w:t>
-            </w:r>
-            <w:proofErr w:type="spellStart"/>
-            <w:r>
-              <w:t>Kund</w:t>
-            </w:r>
-            <w:proofErr w:type="spellEnd"/>
-            <w:r>
-              <w:t xml:space="preserve">. </w:t>
-            </w:r>
-            <w:proofErr w:type="spellStart"/>
-            <w:r>
-              <w:t>Thenproceed</w:t>
-            </w:r>
-            <w:proofErr w:type="spellEnd"/>
-            <w:r>
-              <w:t xml:space="preserve"> towards Atal Tunnel. Atal tunnel starts from </w:t>
+              <w:t xml:space="preserve"> On the way back they can do activities at </w:t>
             </w:r>
             <w:proofErr w:type="spellStart"/>
             <w:r>
@@ -2036,55 +2485,32 @@
             </w:r>
             <w:proofErr w:type="spellEnd"/>
             <w:r>
-              <w:t xml:space="preserve">, and the total distance </w:t>
-            </w:r>
-            <w:proofErr w:type="spellStart"/>
-            <w:r>
-              <w:t>oftunnel</w:t>
-            </w:r>
-            <w:proofErr w:type="spellEnd"/>
-            <w:r>
-              <w:t xml:space="preserve"> is 17 </w:t>
-            </w:r>
-            <w:proofErr w:type="spellStart"/>
-            <w:r>
-              <w:t>kms</w:t>
-            </w:r>
-            <w:proofErr w:type="spellEnd"/>
-            <w:r>
-              <w:t xml:space="preserve"> one way and takes 1hr 15 min one way and tunnel ends at a </w:t>
-            </w:r>
-            <w:proofErr w:type="spellStart"/>
-            <w:r>
-              <w:t>placecalled</w:t>
-            </w:r>
-            <w:proofErr w:type="spellEnd"/>
+              <w:t>. By evening, return to</w:t>
+            </w:r>
             <w:r>
               <w:t xml:space="preserve"> </w:t>
             </w:r>
-            <w:proofErr w:type="gramStart"/>
-            <w:r>
-              <w:t>SISSU .</w:t>
-            </w:r>
-            <w:proofErr w:type="gramEnd"/>
-            <w:r>
-              <w:t xml:space="preserve"> On the way back they can do activities at </w:t>
-            </w:r>
-            <w:proofErr w:type="spellStart"/>
-            <w:r>
-              <w:t>Solang</w:t>
-            </w:r>
-            <w:proofErr w:type="spellEnd"/>
-            <w:r>
-              <w:t xml:space="preserve">. By evening, return </w:t>
-            </w:r>
-            <w:proofErr w:type="spellStart"/>
-            <w:r>
-              <w:t>toyour</w:t>
-            </w:r>
-            <w:proofErr w:type="spellEnd"/>
-            <w:r>
-              <w:t xml:space="preserve"> hotel in </w:t>
+            <w:r>
+              <w:t xml:space="preserve">your hotel in </w:t>
+            </w:r>
+            <w:proofErr w:type="spellStart"/>
+            <w:r>
+              <w:t>Ma</w:t>
+            </w:r>
+            <w:r>
+              <w:t>nali</w:t>
+            </w:r>
+            <w:proofErr w:type="spellEnd"/>
+            <w:r>
+              <w:t xml:space="preserve"> and enjoy a lovely dinner.</w:t>
+            </w:r>
+          </w:p>
+          <w:p>
+            <w:r>
+              <w:t>Dinner and Overnight stay</w:t>
+            </w:r>
+            <w:r>
+              <w:t xml:space="preserve"> at hotel in </w:t>
             </w:r>
             <w:proofErr w:type="spellStart"/>
             <w:r>
@@ -2092,22 +2518,6 @@
             </w:r>
             <w:proofErr w:type="spellEnd"/>
             <w:r>
-              <w:t xml:space="preserve"> and enjoy a lovely dinner. </w:t>
-            </w:r>
-          </w:p>
-          <w:p>
-            <w:r>
-              <w:t>Dinner and Overnight stay</w:t>
-            </w:r>
-            <w:r>
-              <w:t xml:space="preserve"> at hotel in </w:t>
-            </w:r>
-            <w:proofErr w:type="spellStart"/>
-            <w:r>
-              <w:t>Manali</w:t>
-            </w:r>
-            <w:proofErr w:type="spellEnd"/>
-            <w:r>
               <w:t>.</w:t>
             </w:r>
           </w:p>
@@ -2126,23 +2536,115 @@
             </w:r>
           </w:p>
           <w:p>
-            <w:r>
+            <w:pPr>
               <w:rPr>
                 <w:color w:val="FF0000"/>
               </w:rPr>
-              <w:t>Atal Tunnel is not included in this cost and will be on additional cost on direct</w:t>
-            </w:r>
+            </w:pPr>
             <w:r>
               <w:rPr>
                 <w:color w:val="FF0000"/>
               </w:rPr>
-              <w:t xml:space="preserve"> </w:t>
-            </w:r>
-            <w:r>
+              <w:t>Atal Tunnel is not included in this cost and will be on additional cost on direct payment basis</w:t>
+            </w:r>
+          </w:p>
+          <w:p>
+            <w:pPr>
               <w:rPr>
                 <w:color w:val="FF0000"/>
               </w:rPr>
-              <w:t>payment basis</w:t>
+            </w:pPr>
+          </w:p>
+          <w:p>
+            <w:pPr>
+              <w:rPr>
+                <w:color w:val="FF0000"/>
+              </w:rPr>
+            </w:pPr>
+            <w:r>
+              <w:rPr>
+                <w:color w:val="FF0000"/>
+              </w:rPr>
+              <w:t xml:space="preserve">Permit for </w:t>
+            </w:r>
+            <w:proofErr w:type="spellStart"/>
+            <w:r>
+              <w:rPr>
+                <w:color w:val="FF0000"/>
+              </w:rPr>
+              <w:t>Rohtang</w:t>
+            </w:r>
+            <w:proofErr w:type="spellEnd"/>
+            <w:r>
+              <w:rPr>
+                <w:color w:val="FF0000"/>
+              </w:rPr>
+              <w:t xml:space="preserve"> Pass must be directly paid by customer.</w:t>
+            </w:r>
+          </w:p>
+          <w:p>
+            <w:pPr>
+              <w:rPr>
+                <w:color w:val="FF0000"/>
+              </w:rPr>
+            </w:pPr>
+            <w:proofErr w:type="spellStart"/>
+            <w:r>
+              <w:rPr>
+                <w:color w:val="FF0000"/>
+              </w:rPr>
+              <w:t>Rohtang</w:t>
+            </w:r>
+            <w:proofErr w:type="spellEnd"/>
+            <w:r>
+              <w:rPr>
+                <w:color w:val="FF0000"/>
+              </w:rPr>
+              <w:t xml:space="preserve"> Pass is Closed from </w:t>
+            </w:r>
+            <w:proofErr w:type="spellStart"/>
+            <w:r>
+              <w:rPr>
+                <w:color w:val="FF0000"/>
+              </w:rPr>
+              <w:t>mid October</w:t>
+            </w:r>
+            <w:proofErr w:type="spellEnd"/>
+            <w:r>
+              <w:rPr>
+                <w:color w:val="FF0000"/>
+              </w:rPr>
+              <w:t xml:space="preserve"> to </w:t>
+            </w:r>
+            <w:proofErr w:type="spellStart"/>
+            <w:r>
+              <w:rPr>
+                <w:color w:val="FF0000"/>
+              </w:rPr>
+              <w:t>Mid May</w:t>
+            </w:r>
+            <w:proofErr w:type="spellEnd"/>
+            <w:r>
+              <w:rPr>
+                <w:color w:val="FF0000"/>
+              </w:rPr>
+              <w:t>/ June depending on weather conditions at the time of travel</w:t>
+            </w:r>
+          </w:p>
+          <w:p>
+            <w:proofErr w:type="spellStart"/>
+            <w:r>
+              <w:rPr>
+                <w:color w:val="FF0000"/>
+              </w:rPr>
+              <w:t>Rohtang</w:t>
+            </w:r>
+            <w:proofErr w:type="spellEnd"/>
+            <w:r>
+              <w:rPr>
+                <w:color w:val="FF0000"/>
+              </w:rPr>
+              <w:t xml:space="preserve"> pass requires a permit and transfers in a union vehicle - at additional cost at the time of travel.</w:t>
             </w:r>
           </w:p>
         </w:tc>
@@ -2249,23 +2751,19 @@
             </w:r>
             <w:proofErr w:type="spellEnd"/>
             <w:r>
-              <w:t xml:space="preserve"> town visiting newly constructed </w:t>
-            </w:r>
-            <w:proofErr w:type="spellStart"/>
-            <w:r>
-              <w:t>BuddhistMonastery</w:t>
-            </w:r>
-            <w:proofErr w:type="spellEnd"/>
-            <w:r>
-              <w:t xml:space="preserve"> and the handicraft centre. Later, visit the 450 years old </w:t>
-            </w:r>
-            <w:proofErr w:type="spellStart"/>
-            <w:r>
-              <w:t>templededicated</w:t>
-            </w:r>
-            <w:proofErr w:type="spellEnd"/>
-            <w:r>
-              <w:t xml:space="preserve"> to </w:t>
+              <w:t xml:space="preserve"> town visiting newly constructed Buddhist</w:t>
+            </w:r>
+            <w:r>
+              <w:t xml:space="preserve"> </w:t>
+            </w:r>
+            <w:r>
+              <w:t>Monastery and the handicraft centre. Later, visit the 450 years old temple</w:t>
+            </w:r>
+            <w:r>
+              <w:t xml:space="preserve"> </w:t>
+            </w:r>
+            <w:r>
+              <w:t xml:space="preserve">dedicated to </w:t>
             </w:r>
             <w:proofErr w:type="spellStart"/>
             <w:r>
@@ -2273,7 +2771,10 @@
             </w:r>
             <w:proofErr w:type="spellEnd"/>
             <w:r>
-              <w:t xml:space="preserve"> Devi, </w:t>
+              <w:t xml:space="preserve"> D</w:t>
+            </w:r>
+            <w:r>
+              <w:t xml:space="preserve">evi, </w:t>
             </w:r>
             <w:proofErr w:type="spellStart"/>
             <w:r>
@@ -2281,117 +2782,213 @@
             </w:r>
             <w:proofErr w:type="spellEnd"/>
             <w:r>
+              <w:t xml:space="preserve">, </w:t>
+            </w:r>
+            <w:proofErr w:type="spellStart"/>
+            <w:r>
+              <w:t>Vashist</w:t>
+            </w:r>
+            <w:proofErr w:type="spellEnd"/>
+            <w:r>
+              <w:t xml:space="preserve"> </w:t>
+            </w:r>
+            <w:proofErr w:type="spellStart"/>
+            <w:r>
+              <w:t>kund</w:t>
+            </w:r>
+            <w:proofErr w:type="spellEnd"/>
+            <w:r>
+              <w:t xml:space="preserve">, Mall Road. </w:t>
+            </w:r>
+            <w:r>
+              <w:t>Tibetan Monastery</w:t>
+            </w:r>
+            <w:r>
               <w:t xml:space="preserve"> and </w:t>
             </w:r>
+            <w:r>
+              <w:t xml:space="preserve">Van </w:t>
+            </w:r>
+            <w:proofErr w:type="spellStart"/>
+            <w:r>
+              <w:t>Vihar</w:t>
+            </w:r>
+            <w:proofErr w:type="spellEnd"/>
+            <w:r>
+              <w:t xml:space="preserve"> National Park</w:t>
+            </w:r>
+            <w:r>
+              <w:t>.</w:t>
+            </w:r>
+          </w:p>
+          <w:p>
+            <w:proofErr w:type="spellStart"/>
+            <w:r>
+              <w:rPr>
+                <w:b/>
+                <w:bCs/>
+              </w:rPr>
+              <w:t>Hadimba</w:t>
+            </w:r>
+            <w:proofErr w:type="spellEnd"/>
+            <w:r>
+              <w:rPr>
+                <w:b/>
+                <w:bCs/>
+              </w:rPr>
+              <w:t xml:space="preserve"> Devi Temple</w:t>
+            </w:r>
+            <w:r>
+              <w:t xml:space="preserve"> - is an ancient cave temple dedicated to </w:t>
+            </w:r>
+            <w:proofErr w:type="spellStart"/>
+            <w:r>
+              <w:t>Hidimbi</w:t>
+            </w:r>
+            <w:proofErr w:type="spellEnd"/>
+            <w:r>
+              <w:t xml:space="preserve"> Devi, wife</w:t>
+            </w:r>
+            <w:r>
+              <w:t xml:space="preserve"> </w:t>
+            </w:r>
+            <w:r>
+              <w:t xml:space="preserve">of </w:t>
+            </w:r>
+            <w:proofErr w:type="spellStart"/>
+            <w:r>
+              <w:t>Bhima</w:t>
+            </w:r>
+            <w:proofErr w:type="spellEnd"/>
+            <w:r>
+              <w:t xml:space="preserve">, a figure in the Indian epic </w:t>
+            </w:r>
+            <w:proofErr w:type="spellStart"/>
+            <w:r>
+              <w:t>Mahābhārata</w:t>
+            </w:r>
+            <w:proofErr w:type="spellEnd"/>
+            <w:r>
+              <w:t xml:space="preserve">. The temple is surrounded by </w:t>
+            </w:r>
+            <w:proofErr w:type="spellStart"/>
+            <w:r>
+              <w:t>acedar</w:t>
+            </w:r>
+            <w:proofErr w:type="spellEnd"/>
+            <w:r>
+              <w:t xml:space="preserve"> forest at the foot of the </w:t>
+            </w:r>
+            <w:proofErr w:type="spellStart"/>
+            <w:r>
+              <w:t>Himālayas</w:t>
+            </w:r>
+            <w:proofErr w:type="spellEnd"/>
+            <w:r>
+              <w:t>.</w:t>
+            </w:r>
+          </w:p>
+          <w:p>
+            <w:proofErr w:type="spellStart"/>
+            <w:r>
+              <w:rPr>
+                <w:b/>
+                <w:bCs/>
+              </w:rPr>
+              <w:t>Vashisht</w:t>
+            </w:r>
+            <w:proofErr w:type="spellEnd"/>
+            <w:r>
+              <w:t>, an extremely picturesque little place clinging to the steep hill side. On</w:t>
+            </w:r>
+            <w:r>
+              <w:t xml:space="preserve"> </w:t>
+            </w:r>
+            <w:r>
+              <w:t xml:space="preserve">the way up to the village you come upon the </w:t>
+            </w:r>
             <w:proofErr w:type="spellStart"/>
             <w:r>
               <w:t>Vashist</w:t>
             </w:r>
             <w:proofErr w:type="spellEnd"/>
             <w:r>
+              <w:t xml:space="preserve"> hot baths where a natural</w:t>
+            </w:r>
+            <w:r>
               <w:t xml:space="preserve"> </w:t>
             </w:r>
-            <w:proofErr w:type="spellStart"/>
-            <w:r>
-              <w:t>kund</w:t>
-            </w:r>
-            <w:proofErr w:type="spellEnd"/>
-            <w:r>
-              <w:t>.</w:t>
-            </w:r>
-          </w:p>
-          <w:p>
-            <w:proofErr w:type="spellStart"/>
-            <w:r>
-              <w:t>Hadimba</w:t>
-            </w:r>
-            <w:proofErr w:type="spellEnd"/>
-            <w:r>
-              <w:t xml:space="preserve"> Devi Temple - is an ancient cave temple dedicated to </w:t>
-            </w:r>
-            <w:proofErr w:type="spellStart"/>
-            <w:r>
-              <w:t>Hidimbi</w:t>
-            </w:r>
-            <w:proofErr w:type="spellEnd"/>
-            <w:r>
-              <w:t xml:space="preserve"> Devi, </w:t>
-            </w:r>
-            <w:proofErr w:type="spellStart"/>
-            <w:r>
-              <w:t>wifeof</w:t>
-            </w:r>
-            <w:proofErr w:type="spellEnd"/>
-            <w:r>
-              <w:t xml:space="preserve"> </w:t>
-            </w:r>
-            <w:proofErr w:type="spellStart"/>
-            <w:r>
-              <w:t>Bhima</w:t>
-            </w:r>
-            <w:proofErr w:type="spellEnd"/>
-            <w:r>
-              <w:t xml:space="preserve">, a figure in the Indian epic </w:t>
-            </w:r>
-            <w:proofErr w:type="spellStart"/>
-            <w:r>
-              <w:t>Mahābhārata</w:t>
-            </w:r>
-            <w:proofErr w:type="spellEnd"/>
-            <w:r>
-              <w:t xml:space="preserve">. The temple is surrounded by </w:t>
-            </w:r>
-            <w:proofErr w:type="spellStart"/>
-            <w:r>
-              <w:t>acedar</w:t>
-            </w:r>
-            <w:proofErr w:type="spellEnd"/>
-            <w:r>
-              <w:t xml:space="preserve"> forest at the foot of the </w:t>
-            </w:r>
-            <w:proofErr w:type="spellStart"/>
-            <w:r>
-              <w:t>Himālayas</w:t>
-            </w:r>
-            <w:proofErr w:type="spellEnd"/>
-            <w:r>
-              <w:t>.</w:t>
-            </w:r>
-          </w:p>
-          <w:p>
-            <w:proofErr w:type="spellStart"/>
-            <w:r>
-              <w:t>Vashisht</w:t>
-            </w:r>
-            <w:proofErr w:type="spellEnd"/>
-            <w:r>
-              <w:t xml:space="preserve">, an extremely picturesque little place clinging to the steep hill side. </w:t>
-            </w:r>
-            <w:proofErr w:type="spellStart"/>
-            <w:r>
-              <w:t>Onthe</w:t>
-            </w:r>
-            <w:proofErr w:type="spellEnd"/>
-            <w:r>
-              <w:t xml:space="preserve"> way up to the village you come upon the </w:t>
-            </w:r>
-            <w:proofErr w:type="spellStart"/>
-            <w:r>
-              <w:t>Vashist</w:t>
-            </w:r>
-            <w:proofErr w:type="spellEnd"/>
-            <w:r>
-              <w:t xml:space="preserve"> hot baths where a </w:t>
-            </w:r>
-            <w:proofErr w:type="spellStart"/>
-            <w:r>
-              <w:t>naturalsulphur</w:t>
-            </w:r>
-            <w:proofErr w:type="spellEnd"/>
-            <w:r>
-              <w:t xml:space="preserve"> spring is piped into a modern bath-house.</w:t>
-            </w:r>
-          </w:p>
+            <w:r>
+              <w:t>sulphur spring is piped into a modern bath-house.</w:t>
+            </w:r>
+          </w:p>
+          <w:p>
+            <w:r>
+              <w:rPr>
+                <w:b/>
+                <w:bCs/>
+              </w:rPr>
+              <w:t xml:space="preserve">Van </w:t>
+            </w:r>
+            <w:proofErr w:type="spellStart"/>
+            <w:r>
+              <w:rPr>
+                <w:b/>
+                <w:bCs/>
+              </w:rPr>
+              <w:t>Vihar</w:t>
+            </w:r>
+            <w:proofErr w:type="spellEnd"/>
+            <w:r>
+              <w:rPr>
+                <w:b/>
+                <w:bCs/>
+              </w:rPr>
+              <w:t xml:space="preserve"> National </w:t>
+            </w:r>
+            <w:proofErr w:type="gramStart"/>
+            <w:r>
+              <w:rPr>
+                <w:b/>
+                <w:bCs/>
+              </w:rPr>
+              <w:t>Park</w:t>
+            </w:r>
+            <w:r>
+              <w:t xml:space="preserve"> ,</w:t>
+            </w:r>
+            <w:proofErr w:type="gramEnd"/>
+            <w:r>
+              <w:t xml:space="preserve"> a</w:t>
+            </w:r>
+            <w:r>
+              <w:t xml:space="preserve"> beautiful park with tall deodar trees and a small lake for boating.</w:t>
+            </w:r>
+          </w:p>
+          <w:p>
+            <w:r>
+              <w:rPr>
+                <w:b/>
+                <w:bCs/>
+              </w:rPr>
+              <w:t>Club House</w:t>
+            </w:r>
+            <w:r>
+              <w:t>, a</w:t>
+            </w:r>
+            <w:r>
+              <w:t xml:space="preserve">n indoor amusement </w:t>
+            </w:r>
+            <w:proofErr w:type="spellStart"/>
+            <w:r>
+              <w:t>center</w:t>
+            </w:r>
+            <w:proofErr w:type="spellEnd"/>
+            <w:r>
+              <w:t xml:space="preserve"> with games, boating, and shopping.</w:t>
+            </w:r>
+          </w:p>
+          <w:p/>
           <w:p>
             <w:r>
               <w:t xml:space="preserve">Return to hotel by late afternoon. Rest of the day at leisure. </w:t>
@@ -2474,8 +3071,63 @@
                 <w:b/>
                 <w:bCs/>
               </w:rPr>
-              <w:t>Transfer to Shimla</w:t>
-            </w:r>
+              <w:t>Transfer</w:t>
+            </w:r>
+            <w:r>
+              <w:rPr>
+                <w:b/>
+                <w:bCs/>
+              </w:rPr>
+              <w:t xml:space="preserve"> from </w:t>
+            </w:r>
+            <w:proofErr w:type="spellStart"/>
+            <w:r>
+              <w:rPr>
+                <w:b/>
+                <w:bCs/>
+              </w:rPr>
+              <w:t>Manali</w:t>
+            </w:r>
+            <w:proofErr w:type="spellEnd"/>
+            <w:r>
+              <w:rPr>
+                <w:b/>
+                <w:bCs/>
+              </w:rPr>
+              <w:t xml:space="preserve"> to Shimla</w:t>
+            </w:r>
+            <w:r>
+              <w:rPr>
+                <w:b/>
+                <w:bCs/>
+              </w:rPr>
+              <w:t xml:space="preserve"> – </w:t>
+            </w:r>
+            <w:proofErr w:type="spellStart"/>
+            <w:r>
+              <w:rPr>
+                <w:b/>
+                <w:bCs/>
+              </w:rPr>
+              <w:t>Enroute</w:t>
+            </w:r>
+            <w:proofErr w:type="spellEnd"/>
+            <w:r>
+              <w:rPr>
+                <w:b/>
+                <w:bCs/>
+              </w:rPr>
+              <w:t xml:space="preserve"> </w:t>
+            </w:r>
+            <w:proofErr w:type="spellStart"/>
+            <w:r>
+              <w:rPr>
+                <w:b/>
+                <w:bCs/>
+              </w:rPr>
+              <w:t>Kullu</w:t>
+            </w:r>
+            <w:proofErr w:type="spellEnd"/>
           </w:p>
         </w:tc>
       </w:tr>
@@ -2491,74 +3143,164 @@
           </w:tcPr>
           <w:p>
             <w:r>
-              <w:t xml:space="preserve">After breakfast today, check out from your hotel in </w:t>
-            </w:r>
-            <w:proofErr w:type="spellStart"/>
-            <w:r>
-              <w:t>Manali</w:t>
-            </w:r>
-            <w:proofErr w:type="spellEnd"/>
-            <w:r>
-              <w:t xml:space="preserve"> and get ready to proceed </w:t>
-            </w:r>
-            <w:proofErr w:type="spellStart"/>
-            <w:r>
-              <w:t>toShimla</w:t>
-            </w:r>
-            <w:proofErr w:type="spellEnd"/>
-            <w:r>
-              <w:t xml:space="preserve"> (by road). The capital city of Himachal Pradesh and most popular hill station</w:t>
-            </w:r>
+              <w:t>After breakfast</w:t>
+            </w:r>
+            <w:r>
+              <w:t>, checkout from hotel</w:t>
+            </w:r>
+            <w:r>
+              <w:t xml:space="preserve"> proceed towards </w:t>
+            </w:r>
+            <w:r>
+              <w:t>Shimla</w:t>
+            </w:r>
+            <w:r>
+              <w:t xml:space="preserve">. </w:t>
+            </w:r>
+            <w:proofErr w:type="spellStart"/>
+            <w:r>
+              <w:t>Enroute</w:t>
+            </w:r>
+            <w:proofErr w:type="spellEnd"/>
             <w:r>
               <w:t xml:space="preserve"> </w:t>
             </w:r>
             <w:r>
-              <w:t xml:space="preserve">in the north of India was once the Himalayan summer capital of the British Raj in1864 (2000 m above sea level). Today, happy </w:t>
-            </w:r>
-            <w:proofErr w:type="spellStart"/>
-            <w:r>
-              <w:t>vacactioners</w:t>
-            </w:r>
-            <w:proofErr w:type="spellEnd"/>
-            <w:r>
-              <w:t xml:space="preserve"> from all around flock </w:t>
-            </w:r>
-            <w:proofErr w:type="spellStart"/>
-            <w:r>
-              <w:t>hereto</w:t>
-            </w:r>
-            <w:proofErr w:type="spellEnd"/>
-            <w:r>
-              <w:t xml:space="preserve"> get away from the daily hustle of city life. Set amid beautiful hills, </w:t>
-            </w:r>
-            <w:proofErr w:type="spellStart"/>
-            <w:r>
-              <w:t>meanderingstreets</w:t>
-            </w:r>
-            <w:proofErr w:type="spellEnd"/>
-            <w:r>
-              <w:t xml:space="preserve"> and mystical woods, Shimla treats honeymooners and families to </w:t>
-            </w:r>
-            <w:proofErr w:type="spellStart"/>
-            <w:r>
-              <w:t>captivatingnatural</w:t>
-            </w:r>
-            <w:proofErr w:type="spellEnd"/>
-            <w:r>
-              <w:t xml:space="preserve"> beauty. What also attracts tourists here is the chance to go </w:t>
-            </w:r>
-            <w:proofErr w:type="spellStart"/>
-            <w:r>
-              <w:t>trekking</w:t>
-            </w:r>
-            <w:proofErr w:type="gramStart"/>
-            <w:r>
-              <w:t>,mountaineering</w:t>
-            </w:r>
-            <w:proofErr w:type="spellEnd"/>
-            <w:proofErr w:type="gramEnd"/>
-            <w:r>
-              <w:t xml:space="preserve">, skiing and other adventure activities. Upon arrival in Shimla, check into your hotel, get comfortable and have a delicious dinner. </w:t>
+              <w:t>s</w:t>
+            </w:r>
+            <w:r>
+              <w:t xml:space="preserve">top at </w:t>
+            </w:r>
+            <w:proofErr w:type="spellStart"/>
+            <w:r>
+              <w:rPr>
+                <w:b/>
+                <w:bCs/>
+              </w:rPr>
+              <w:t>kullu</w:t>
+            </w:r>
+            <w:proofErr w:type="spellEnd"/>
+            <w:r>
+              <w:t xml:space="preserve">, known for </w:t>
+            </w:r>
+            <w:r>
+              <w:rPr>
+                <w:b/>
+                <w:bCs/>
+              </w:rPr>
+              <w:t>River rafting</w:t>
+            </w:r>
+            <w:r>
+              <w:t xml:space="preserve"> (at own cost).</w:t>
+            </w:r>
+            <w:r>
+              <w:t xml:space="preserve"> </w:t>
+            </w:r>
+            <w:r>
+              <w:t>I</w:t>
+            </w:r>
+            <w:r>
+              <w:t>f time permits</w:t>
+            </w:r>
+            <w:r>
+              <w:t xml:space="preserve"> also </w:t>
+            </w:r>
+            <w:r>
+              <w:t xml:space="preserve">visit </w:t>
+            </w:r>
+            <w:proofErr w:type="spellStart"/>
+            <w:r>
+              <w:rPr>
+                <w:b/>
+                <w:bCs/>
+              </w:rPr>
+              <w:t>Sundernagar</w:t>
+            </w:r>
+            <w:proofErr w:type="spellEnd"/>
+            <w:r>
+              <w:rPr>
+                <w:b/>
+                <w:bCs/>
+              </w:rPr>
+              <w:t xml:space="preserve"> lake, </w:t>
+            </w:r>
+            <w:proofErr w:type="spellStart"/>
+            <w:r>
+              <w:rPr>
+                <w:b/>
+                <w:bCs/>
+              </w:rPr>
+              <w:t>Pandoh</w:t>
+            </w:r>
+            <w:proofErr w:type="spellEnd"/>
+            <w:r>
+              <w:rPr>
+                <w:b/>
+                <w:bCs/>
+              </w:rPr>
+              <w:t xml:space="preserve"> </w:t>
+            </w:r>
+            <w:r>
+              <w:rPr>
+                <w:b/>
+                <w:bCs/>
+              </w:rPr>
+              <w:t xml:space="preserve">dam, </w:t>
+            </w:r>
+            <w:proofErr w:type="spellStart"/>
+            <w:r>
+              <w:rPr>
+                <w:b/>
+                <w:bCs/>
+              </w:rPr>
+              <w:t>Kullu</w:t>
+            </w:r>
+            <w:proofErr w:type="spellEnd"/>
+            <w:r>
+              <w:rPr>
+                <w:b/>
+                <w:bCs/>
+              </w:rPr>
+              <w:t xml:space="preserve"> shaw</w:t>
+            </w:r>
+            <w:r>
+              <w:rPr>
+                <w:b/>
+                <w:bCs/>
+              </w:rPr>
+              <w:t>l factory</w:t>
+            </w:r>
+            <w:r>
+              <w:rPr>
+                <w:b/>
+                <w:bCs/>
+              </w:rPr>
+              <w:t xml:space="preserve">, and </w:t>
+            </w:r>
+            <w:proofErr w:type="spellStart"/>
+            <w:r>
+              <w:rPr>
+                <w:b/>
+                <w:bCs/>
+              </w:rPr>
+              <w:t>Vaishnodevi</w:t>
+            </w:r>
+            <w:proofErr w:type="spellEnd"/>
+            <w:r>
+              <w:rPr>
+                <w:b/>
+                <w:bCs/>
+              </w:rPr>
+              <w:t xml:space="preserve"> temple</w:t>
+            </w:r>
+            <w:r>
+              <w:t>.</w:t>
+            </w:r>
+          </w:p>
+          <w:p/>
+          <w:p>
+            <w:r>
+              <w:t xml:space="preserve">Upon arrival in Shimla, check into your hotel, get comfortable and have a delicious dinner. </w:t>
             </w:r>
           </w:p>
           <w:p>
@@ -2566,15 +3308,13 @@
               <w:t>Dinner and Overnight stay</w:t>
             </w:r>
             <w:r>
-              <w:t xml:space="preserve"> at hotel </w:t>
-            </w:r>
-            <w:proofErr w:type="spellStart"/>
-            <w:r>
-              <w:t>inShimla</w:t>
-            </w:r>
-            <w:proofErr w:type="spellEnd"/>
-            <w:r>
-              <w:t>.</w:t>
+              <w:t xml:space="preserve"> at hotel in</w:t>
+            </w:r>
+            <w:r>
+              <w:t xml:space="preserve"> </w:t>
+            </w:r>
+            <w:r>
+              <w:t>Shimla.</w:t>
             </w:r>
           </w:p>
         </w:tc>
@@ -2678,35 +3418,33 @@
             </w:r>
             <w:proofErr w:type="spellStart"/>
             <w:r>
+              <w:rPr>
+                <w:b/>
+                <w:bCs/>
+              </w:rPr>
               <w:t>Kufri</w:t>
             </w:r>
             <w:proofErr w:type="spellEnd"/>
             <w:r>
-              <w:t xml:space="preserve"> - a </w:t>
-            </w:r>
-            <w:proofErr w:type="spellStart"/>
-            <w:r>
-              <w:t>havenfor</w:t>
-            </w:r>
-            <w:proofErr w:type="spellEnd"/>
-            <w:r>
-              <w:t xml:space="preserve"> nature enthusiasts and wildlife lovers. With panoramic views of </w:t>
-            </w:r>
-            <w:proofErr w:type="spellStart"/>
-            <w:r>
-              <w:t>theHimalayas</w:t>
-            </w:r>
-            <w:proofErr w:type="spellEnd"/>
-            <w:r>
-              <w:t xml:space="preserve">, steep hikes, adventure sports and quite a few fun and </w:t>
-            </w:r>
-            <w:proofErr w:type="spellStart"/>
-            <w:r>
-              <w:t>interestingsightseeing</w:t>
-            </w:r>
-            <w:proofErr w:type="spellEnd"/>
-            <w:r>
-              <w:t xml:space="preserve"> attractions, </w:t>
+              <w:t xml:space="preserve"> - a haven</w:t>
+            </w:r>
+            <w:r>
+              <w:t xml:space="preserve"> </w:t>
+            </w:r>
+            <w:r>
+              <w:t>for nature enthusiasts and wildlife lovers. With panoramic views of the</w:t>
+            </w:r>
+            <w:r>
+              <w:t xml:space="preserve"> </w:t>
+            </w:r>
+            <w:r>
+              <w:t>Himalayas, steep hikes, adventure sports and quite a few fun and interesting</w:t>
+            </w:r>
+            <w:r>
+              <w:t xml:space="preserve"> </w:t>
+            </w:r>
+            <w:r>
+              <w:t xml:space="preserve">sightseeing attractions, </w:t>
             </w:r>
             <w:proofErr w:type="spellStart"/>
             <w:r>
@@ -2719,7 +3457,6 @@
           </w:p>
           <w:p>
             <w:r>
-              <w:lastRenderedPageBreak/>
               <w:t xml:space="preserve">Popular </w:t>
             </w:r>
             <w:proofErr w:type="gramStart"/>
@@ -2728,16 +3465,14 @@
             </w:r>
             <w:proofErr w:type="gramEnd"/>
             <w:r>
-              <w:t xml:space="preserve"> with trekkers, the splendid weather and stunning natural </w:t>
-            </w:r>
-            <w:proofErr w:type="spellStart"/>
-            <w:r>
-              <w:t>beautymake</w:t>
-            </w:r>
-            <w:proofErr w:type="spellEnd"/>
+              <w:t xml:space="preserve"> with trekkers, the splendid weather and stunning natural beauty</w:t>
+            </w:r>
             <w:r>
               <w:t xml:space="preserve"> </w:t>
             </w:r>
+            <w:r>
+              <w:t xml:space="preserve">make </w:t>
+            </w:r>
             <w:proofErr w:type="spellStart"/>
             <w:r>
               <w:t>Kufri</w:t>
@@ -2752,23 +3487,29 @@
             </w:r>
             <w:proofErr w:type="spellEnd"/>
             <w:r>
-              <w:t xml:space="preserve"> is also the venue for </w:t>
-            </w:r>
-            <w:proofErr w:type="spellStart"/>
-            <w:r>
-              <w:t>anannual</w:t>
-            </w:r>
-            <w:proofErr w:type="spellEnd"/>
-            <w:r>
-              <w:t xml:space="preserve"> winter sports festival held in February. With the oldest skiing slopes </w:t>
-            </w:r>
-            <w:proofErr w:type="spellStart"/>
-            <w:r>
-              <w:t>inHimachal</w:t>
-            </w:r>
-            <w:proofErr w:type="spellEnd"/>
-            <w:r>
-              <w:t xml:space="preserve"> Pradesh, </w:t>
+              <w:t xml:space="preserve"> is also the venue for an</w:t>
+            </w:r>
+            <w:r>
+              <w:t xml:space="preserve"> </w:t>
+            </w:r>
+            <w:r>
+              <w:t xml:space="preserve">annual winter sports festival held in February. With the </w:t>
+            </w:r>
+            <w:r>
+              <w:rPr>
+                <w:b/>
+                <w:bCs/>
+              </w:rPr>
+              <w:t>oldest skiing slopes</w:t>
+            </w:r>
+            <w:r>
+              <w:t xml:space="preserve"> in</w:t>
+            </w:r>
+            <w:r>
+              <w:t xml:space="preserve"> </w:t>
+            </w:r>
+            <w:r>
+              <w:t xml:space="preserve">Himachal Pradesh, </w:t>
             </w:r>
             <w:proofErr w:type="spellStart"/>
             <w:r>
@@ -2776,51 +3517,90 @@
             </w:r>
             <w:proofErr w:type="spellEnd"/>
             <w:r>
-              <w:t xml:space="preserve"> is also famously referred to as a ski </w:t>
-            </w:r>
-            <w:proofErr w:type="spellStart"/>
-            <w:r>
-              <w:t>destination.Himalayan</w:t>
-            </w:r>
-            <w:proofErr w:type="spellEnd"/>
-            <w:r>
-              <w:t xml:space="preserve"> Nature Park in the outskirts is home to over 180 varieties of fauna.</w:t>
-            </w:r>
-          </w:p>
-          <w:p>
-            <w:r>
-              <w:t xml:space="preserve">After, visit the famous Mall Road in Shimla. Also check out the pleasant </w:t>
-            </w:r>
-            <w:proofErr w:type="spellStart"/>
-            <w:r>
-              <w:t>smallsquare</w:t>
-            </w:r>
-            <w:proofErr w:type="spellEnd"/>
-            <w:r>
-              <w:t xml:space="preserve"> Scandal Point and </w:t>
-            </w:r>
-            <w:proofErr w:type="spellStart"/>
-            <w:r>
+              <w:t xml:space="preserve"> is also famously referred to as a ski destination.</w:t>
+            </w:r>
+            <w:r>
+              <w:t xml:space="preserve"> </w:t>
+            </w:r>
+            <w:r>
+              <w:rPr>
+                <w:b/>
+                <w:bCs/>
+              </w:rPr>
+              <w:t>Himalayan Nature Park</w:t>
+            </w:r>
+            <w:r>
+              <w:t xml:space="preserve"> in the outskirts is home to over 180 varieties of fauna.</w:t>
+            </w:r>
+          </w:p>
+          <w:p>
+            <w:r>
+              <w:t xml:space="preserve">After, visit the famous </w:t>
+            </w:r>
+            <w:r>
+              <w:rPr>
+                <w:b/>
+                <w:bCs/>
+              </w:rPr>
+              <w:t>Mall Road</w:t>
+            </w:r>
+            <w:r>
+              <w:t xml:space="preserve"> in Shimla. Also check out the pleasant small</w:t>
+            </w:r>
+            <w:r>
+              <w:t xml:space="preserve"> </w:t>
+            </w:r>
+            <w:r>
+              <w:t>square Scandal Point</w:t>
+            </w:r>
+            <w:r>
+              <w:t xml:space="preserve">, </w:t>
+            </w:r>
+            <w:r>
+              <w:rPr>
+                <w:b/>
+                <w:bCs/>
+              </w:rPr>
+              <w:t>The Ridge, Christ Church</w:t>
+            </w:r>
+            <w:r>
+              <w:rPr>
+                <w:b/>
+                <w:bCs/>
+              </w:rPr>
+              <w:t xml:space="preserve"> and </w:t>
+            </w:r>
+            <w:proofErr w:type="spellStart"/>
+            <w:r>
+              <w:rPr>
+                <w:b/>
+                <w:bCs/>
+              </w:rPr>
               <w:t>Jhakoo</w:t>
             </w:r>
             <w:proofErr w:type="spellEnd"/>
             <w:r>
-              <w:t xml:space="preserve"> Temple. Return to your hotel and have a </w:t>
-            </w:r>
-            <w:proofErr w:type="spellStart"/>
-            <w:r>
-              <w:t>tastydinner</w:t>
-            </w:r>
-            <w:proofErr w:type="spellEnd"/>
-            <w:r>
-              <w:t>.</w:t>
-            </w:r>
-          </w:p>
-          <w:p>
+              <w:rPr>
+                <w:b/>
+                <w:bCs/>
+              </w:rPr>
+              <w:t xml:space="preserve"> Temple</w:t>
+            </w:r>
+            <w:r>
+              <w:t>. Return to your hotel and have a tasty</w:t>
+            </w:r>
             <w:r>
               <w:t xml:space="preserve"> </w:t>
             </w:r>
             <w:r>
+              <w:t>dinner.</w:t>
+            </w:r>
+          </w:p>
+          <w:p>
+            <w:r>
+              <w:t xml:space="preserve"> </w:t>
+            </w:r>
+            <w:r>
               <w:t>Dinner and Overnight stay</w:t>
             </w:r>
             <w:r>
@@ -2860,47 +3640,31 @@
               <w:rPr>
                 <w:color w:val="FF0000"/>
               </w:rPr>
-              <w:t xml:space="preserve"> temple because of the location. </w:t>
-            </w:r>
-            <w:proofErr w:type="spellStart"/>
+              <w:t xml:space="preserve"> temple because of the location. The</w:t>
+            </w:r>
             <w:r>
               <w:rPr>
                 <w:color w:val="FF0000"/>
               </w:rPr>
-              <w:t>Theguests</w:t>
-            </w:r>
-            <w:proofErr w:type="spellEnd"/>
+              <w:t xml:space="preserve"> </w:t>
+            </w:r>
             <w:r>
               <w:rPr>
                 <w:color w:val="FF0000"/>
               </w:rPr>
-              <w:t xml:space="preserve"> can take a shared taxi available on Mall Road and visit the temple. </w:t>
-            </w:r>
-            <w:proofErr w:type="spellStart"/>
+              <w:t>guests can take a shared taxi available on Mall Road and visit the temple. It’s</w:t>
+            </w:r>
             <w:r>
               <w:rPr>
                 <w:color w:val="FF0000"/>
               </w:rPr>
-              <w:t>It’sadvisable</w:t>
-            </w:r>
-            <w:proofErr w:type="spellEnd"/>
+              <w:t xml:space="preserve"> </w:t>
+            </w:r>
             <w:r>
               <w:rPr>
                 <w:color w:val="FF0000"/>
               </w:rPr>
-              <w:t xml:space="preserve"> to visit the temple before it turns dark; hence the guests can first visit the</w:t>
-            </w:r>
-            <w:r>
-              <w:rPr>
-                <w:color w:val="FF0000"/>
-              </w:rPr>
-              <w:t xml:space="preserve"> t</w:t>
-            </w:r>
-            <w:r>
-              <w:rPr>
-                <w:color w:val="FF0000"/>
-              </w:rPr>
-              <w:t>emple and then spend time on the mall road.</w:t>
+              <w:t>advisable to visit the temple before it turns dark; hence the guests can first visit the temple and then spend time on the mall road.</w:t>
             </w:r>
           </w:p>
         </w:tc>
@@ -3003,8 +3767,6 @@
             <w:r>
               <w:t>flight/Train back to home.</w:t>
             </w:r>
-            <w:bookmarkStart w:id="0" w:name="_GoBack"/>
-            <w:bookmarkEnd w:id="0"/>
           </w:p>
         </w:tc>
       </w:tr>
@@ -3817,6 +4579,32 @@
     </w:p>
     <w:p>
       <w:pPr>
+        <w:shd w:val="clear" w:color="auto" w:fill="FFFFFF"/>
+        <w:spacing w:after="200" w:line="253" w:lineRule="atLeast"/>
+        <w:ind w:left="360" w:right="1080"/>
+        <w:jc w:val="both"/>
+        <w:rPr>
+          <w:rFonts w:eastAsia="Times New Roman" w:cstheme="minorHAnsi"/>
+          <w:color w:val="222222"/>
+          <w:lang w:eastAsia="en-IN" w:bidi="mr-IN"/>
+        </w:rPr>
+      </w:pPr>
+    </w:p>
+    <w:p>
+      <w:pPr>
+        <w:shd w:val="clear" w:color="auto" w:fill="FFFFFF"/>
+        <w:spacing w:after="200" w:line="253" w:lineRule="atLeast"/>
+        <w:ind w:left="360" w:right="1080"/>
+        <w:jc w:val="both"/>
+        <w:rPr>
+          <w:rFonts w:eastAsia="Times New Roman" w:cstheme="minorHAnsi"/>
+          <w:color w:val="222222"/>
+          <w:lang w:eastAsia="en-IN" w:bidi="mr-IN"/>
+        </w:rPr>
+      </w:pPr>
+    </w:p>
+    <w:p>
+      <w:pPr>
         <w:pStyle w:val="Heading2"/>
         <w:jc w:val="center"/>
         <w:rPr>
@@ -3839,6 +4627,7 @@
           <w:u w:val="single"/>
           <w:lang w:val="en-US"/>
         </w:rPr>
+        <w:lastRenderedPageBreak/>
         <w:t>Cancellation Policy</w:t>
       </w:r>
     </w:p>
@@ -3879,7 +4668,6 @@
           <w:color w:val="222222"/>
           <w:lang w:eastAsia="en-IN" w:bidi="mr-IN"/>
         </w:rPr>
-        <w:lastRenderedPageBreak/>
         <w:t xml:space="preserve">Any confirmed package booking cancellation will attract </w:t>
       </w:r>
       <w:proofErr w:type="spellStart"/>
@@ -4801,10 +5589,7 @@
     </w:r>
     <w:proofErr w:type="spellEnd"/>
     <w:r>
-      <w:t xml:space="preserve"> Housing Society</w:t>
-    </w:r>
-    <w:r>
-      <w:t>,</w:t>
+      <w:t xml:space="preserve"> Housing Society,</w:t>
     </w:r>
   </w:p>
   <w:p>
@@ -4938,9 +5723,9 @@
             </wp:anchor>
           </w:drawing>
         </mc:Choice>
-        <mc:Fallback xmlns:w16se="http://schemas.microsoft.com/office/word/2015/wordml/symex" xmlns:w16sdtfl="http://schemas.microsoft.com/office/word/2024/wordml/sdtformatlock" xmlns:w16sdtdh="http://schemas.microsoft.com/office/word/2020/wordml/sdtdatahash" xmlns:w16du="http://schemas.microsoft.com/office/word/2023/wordml/word16du" xmlns:w16="http://schemas.microsoft.com/office/word/2018/wordml" xmlns:w16cid="http://schemas.microsoft.com/office/word/2016/wordml/cid" xmlns:w16cex="http://schemas.microsoft.com/office/word/2018/wordml/cex" xmlns:oel="http://schemas.microsoft.com/office/2019/extlst" xmlns:am3d="http://schemas.microsoft.com/office/drawing/2017/model3d" xmlns:aink="http://schemas.microsoft.com/office/drawing/2016/ink" xmlns:cx8="http://schemas.microsoft.com/office/drawing/2016/5/14/chartex" xmlns:cx7="http://schemas.microsoft.com/office/drawing/2016/5/13/chartex" xmlns:cx6="http://schemas.microsoft.com/office/drawing/2016/5/12/chartex" xmlns:cx5="http://schemas.microsoft.com/office/drawing/2016/5/11/chartex" xmlns:cx4="http://schemas.microsoft.com/office/drawing/2016/5/10/chartex" xmlns:cx3="http://schemas.microsoft.com/office/drawing/2016/5/9/chartex" xmlns:cx2="http://schemas.microsoft.com/office/drawing/2015/10/21/chartex" xmlns:cx1="http://schemas.microsoft.com/office/drawing/2015/9/8/chartex" xmlns:cx="http://schemas.microsoft.com/office/drawing/2014/chartex">
+        <mc:Fallback>
           <w:pict>
-            <v:line w14:anchorId="278048EF" id="Straight Connector 3" o:spid="_x0000_s1026" style="position:absolute;z-index:251659264;visibility:visible;mso-wrap-style:square;mso-wrap-distance-left:9pt;mso-wrap-distance-top:0;mso-wrap-distance-right:9pt;mso-wrap-distance-bottom:0;mso-position-horizontal:absolute;mso-position-horizontal-relative:text;mso-position-vertical:absolute;mso-position-vertical-relative:text" from="-41.25pt,9.2pt" to="494.25pt,9.95pt" o:gfxdata="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" strokecolor="black [3200]" strokeweight=".5pt">
+            <v:line w14:anchorId="79B92788" id="Straight Connector 3" o:spid="_x0000_s1026" style="position:absolute;z-index:251659264;visibility:visible;mso-wrap-style:square;mso-wrap-distance-left:9pt;mso-wrap-distance-top:0;mso-wrap-distance-right:9pt;mso-wrap-distance-bottom:0;mso-position-horizontal:absolute;mso-position-horizontal-relative:text;mso-position-vertical:absolute;mso-position-vertical-relative:text" from="-41.25pt,9.2pt" to="494.25pt,9.95pt" o:gfxdata="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" strokecolor="black [3200]" strokeweight=".5pt">
               <v:stroke joinstyle="miter"/>
             </v:line>
           </w:pict>
@@ -6837,6 +7622,29 @@
       <w:szCs w:val="26"/>
     </w:rPr>
   </w:style>
+  <w:style w:type="paragraph" w:styleId="Heading3">
+    <w:name w:val="heading 3"/>
+    <w:basedOn w:val="Normal"/>
+    <w:next w:val="Normal"/>
+    <w:link w:val="Heading3Char"/>
+    <w:uiPriority w:val="9"/>
+    <w:semiHidden/>
+    <w:unhideWhenUsed/>
+    <w:qFormat/>
+    <w:rsid w:val="009909B8"/>
+    <w:pPr>
+      <w:keepNext/>
+      <w:keepLines/>
+      <w:spacing w:before="40" w:after="0"/>
+      <w:outlineLvl w:val="2"/>
+    </w:pPr>
+    <w:rPr>
+      <w:rFonts w:asciiTheme="majorHAnsi" w:eastAsiaTheme="majorEastAsia" w:hAnsiTheme="majorHAnsi" w:cstheme="majorBidi"/>
+      <w:color w:val="1F4D78" w:themeColor="accent1" w:themeShade="7F"/>
+      <w:sz w:val="24"/>
+      <w:szCs w:val="24"/>
+    </w:rPr>
+  </w:style>
   <w:style w:type="character" w:default="1" w:styleId="DefaultParagraphFont">
     <w:name w:val="Default Paragraph Font"/>
     <w:uiPriority w:val="1"/>
@@ -7055,6 +7863,50 @@
       <w:bCs/>
     </w:rPr>
   </w:style>
+  <w:style w:type="paragraph" w:styleId="BalloonText">
+    <w:name w:val="Balloon Text"/>
+    <w:basedOn w:val="Normal"/>
+    <w:link w:val="BalloonTextChar"/>
+    <w:uiPriority w:val="99"/>
+    <w:semiHidden/>
+    <w:unhideWhenUsed/>
+    <w:rsid w:val="0059752F"/>
+    <w:pPr>
+      <w:spacing w:after="0" w:line="240" w:lineRule="auto"/>
+    </w:pPr>
+    <w:rPr>
+      <w:rFonts w:ascii="Tahoma" w:hAnsi="Tahoma" w:cs="Tahoma"/>
+      <w:sz w:val="16"/>
+      <w:szCs w:val="16"/>
+    </w:rPr>
+  </w:style>
+  <w:style w:type="character" w:customStyle="1" w:styleId="BalloonTextChar">
+    <w:name w:val="Balloon Text Char"/>
+    <w:basedOn w:val="DefaultParagraphFont"/>
+    <w:link w:val="BalloonText"/>
+    <w:uiPriority w:val="99"/>
+    <w:semiHidden/>
+    <w:rsid w:val="0059752F"/>
+    <w:rPr>
+      <w:rFonts w:ascii="Tahoma" w:hAnsi="Tahoma" w:cs="Tahoma"/>
+      <w:sz w:val="16"/>
+      <w:szCs w:val="16"/>
+    </w:rPr>
+  </w:style>
+  <w:style w:type="character" w:customStyle="1" w:styleId="Heading3Char">
+    <w:name w:val="Heading 3 Char"/>
+    <w:basedOn w:val="DefaultParagraphFont"/>
+    <w:link w:val="Heading3"/>
+    <w:uiPriority w:val="9"/>
+    <w:semiHidden/>
+    <w:rsid w:val="009909B8"/>
+    <w:rPr>
+      <w:rFonts w:asciiTheme="majorHAnsi" w:eastAsiaTheme="majorEastAsia" w:hAnsiTheme="majorHAnsi" w:cstheme="majorBidi"/>
+      <w:color w:val="1F4D78" w:themeColor="accent1" w:themeShade="7F"/>
+      <w:sz w:val="24"/>
+      <w:szCs w:val="24"/>
+    </w:rPr>
+  </w:style>
 </w:styles>
 </file>
 
@@ -7101,7 +7953,7 @@
     </a:clrScheme>
     <a:fontScheme name="Office">
       <a:majorFont>
-        <a:latin typeface="Calibri Light" panose="020F0302020204030204"/>
+        <a:latin typeface="Calibri Light"/>
         <a:ea typeface=""/>
         <a:cs typeface=""/>
         <a:font script="Jpan" typeface="ＭＳ ゴシック"/>
@@ -7136,7 +7988,7 @@
         <a:font script="Geor" typeface="Sylfaen"/>
       </a:majorFont>
       <a:minorFont>
-        <a:latin typeface="Calibri" panose="020F0502020204030204"/>
+        <a:latin typeface="Calibri"/>
         <a:ea typeface=""/>
         <a:cs typeface=""/>
         <a:font script="Jpan" typeface="ＭＳ 明朝"/>

</xml_diff>

<commit_message>
Kashmir and mussoorie package updates
</commit_message>
<xml_diff>
--- a/itinerary/himachal/Snehalmaushi/Himachal.docx
+++ b/itinerary/himachal/Snehalmaushi/Himachal.docx
@@ -236,7 +236,15 @@
                 <w:bCs/>
                 <w:lang w:val="en-US"/>
               </w:rPr>
-              <w:t>75000/-</w:t>
+              <w:t>72</w:t>
+            </w:r>
+            <w:r>
+              <w:rPr>
+                <w:b/>
+                <w:bCs/>
+                <w:lang w:val="en-US"/>
+              </w:rPr>
+              <w:t>000/-</w:t>
             </w:r>
           </w:p>
         </w:tc>
@@ -284,7 +292,17 @@
                 <w:bCs/>
                 <w:lang w:val="en-US"/>
               </w:rPr>
-              <w:t>75000/-</w:t>
+              <w:t>72</w:t>
+            </w:r>
+            <w:bookmarkStart w:id="0" w:name="_GoBack"/>
+            <w:bookmarkEnd w:id="0"/>
+            <w:r>
+              <w:rPr>
+                <w:b/>
+                <w:bCs/>
+                <w:lang w:val="en-US"/>
+              </w:rPr>
+              <w:t>000/-</w:t>
             </w:r>
           </w:p>
         </w:tc>
@@ -585,7 +603,15 @@
                 <w:color w:val="000000"/>
                 <w:lang w:bidi="mr-IN"/>
               </w:rPr>
-              <w:t>2 N Dalhousie</w:t>
+              <w:t>1</w:t>
+            </w:r>
+            <w:r>
+              <w:rPr>
+                <w:rFonts w:ascii="Calibri" w:eastAsia="Times New Roman" w:hAnsi="Calibri" w:cs="Calibri"/>
+                <w:color w:val="000000"/>
+                <w:lang w:bidi="mr-IN"/>
+              </w:rPr>
+              <w:t xml:space="preserve"> N Dalhousie</w:t>
             </w:r>
           </w:p>
           <w:p>
@@ -640,7 +666,15 @@
                 <w:color w:val="222222"/>
                 <w:lang w:eastAsia="en-IN" w:bidi="mr-IN"/>
               </w:rPr>
-              <w:t>07 Apr</w:t>
+              <w:t>06</w:t>
+            </w:r>
+            <w:r>
+              <w:rPr>
+                <w:rFonts w:eastAsia="Times New Roman" w:cstheme="minorHAnsi"/>
+                <w:color w:val="222222"/>
+                <w:lang w:eastAsia="en-IN" w:bidi="mr-IN"/>
+              </w:rPr>
+              <w:t xml:space="preserve"> Apr</w:t>
             </w:r>
           </w:p>
         </w:tc>
@@ -771,40 +805,16 @@
                 <w:color w:val="000000"/>
                 <w:lang w:bidi="mr-IN"/>
               </w:rPr>
-              <w:t>0</w:t>
-            </w:r>
+              <w:t xml:space="preserve">01 N </w:t>
+            </w:r>
+            <w:proofErr w:type="spellStart"/>
             <w:r>
               <w:rPr>
                 <w:rFonts w:ascii="Calibri" w:eastAsia="Times New Roman" w:hAnsi="Calibri" w:cs="Calibri"/>
                 <w:color w:val="000000"/>
                 <w:lang w:bidi="mr-IN"/>
               </w:rPr>
-              <w:t xml:space="preserve">1 N </w:t>
-            </w:r>
-            <w:proofErr w:type="spellStart"/>
-            <w:r>
-              <w:rPr>
-                <w:rFonts w:ascii="Calibri" w:eastAsia="Times New Roman" w:hAnsi="Calibri" w:cs="Calibri"/>
-                <w:color w:val="000000"/>
-                <w:lang w:bidi="mr-IN"/>
-              </w:rPr>
-              <w:t>Dhar</w:t>
-            </w:r>
-            <w:r>
-              <w:rPr>
-                <w:rFonts w:ascii="Calibri" w:eastAsia="Times New Roman" w:hAnsi="Calibri" w:cs="Calibri"/>
-                <w:color w:val="000000"/>
-                <w:lang w:bidi="mr-IN"/>
-              </w:rPr>
-              <w:t>a</w:t>
-            </w:r>
-            <w:r>
-              <w:rPr>
-                <w:rFonts w:ascii="Calibri" w:eastAsia="Times New Roman" w:hAnsi="Calibri" w:cs="Calibri"/>
-                <w:color w:val="000000"/>
-                <w:lang w:bidi="mr-IN"/>
-              </w:rPr>
-              <w:t>mshala</w:t>
+              <w:t>Khajjar</w:t>
             </w:r>
             <w:proofErr w:type="spellEnd"/>
           </w:p>
@@ -828,7 +838,7 @@
                 <w:color w:val="222222"/>
                 <w:lang w:eastAsia="en-IN" w:bidi="mr-IN"/>
               </w:rPr>
-              <w:t>07 Apr</w:t>
+              <w:t>06 Apr</w:t>
             </w:r>
           </w:p>
         </w:tc>
@@ -851,7 +861,7 @@
                 <w:color w:val="222222"/>
                 <w:lang w:eastAsia="en-IN" w:bidi="mr-IN"/>
               </w:rPr>
-              <w:t>08 Apr</w:t>
+              <w:t>07 Apr</w:t>
             </w:r>
           </w:p>
         </w:tc>
@@ -887,9 +897,9 @@
           <w:p>
             <w:pPr>
               <w:rPr>
-                <w:rFonts w:eastAsia="Times New Roman" w:cstheme="minorHAnsi"/>
+                <w:rFonts w:ascii="Calibri" w:eastAsia="Times New Roman" w:hAnsi="Calibri" w:cs="Calibri"/>
                 <w:color w:val="222222"/>
-                <w:lang w:eastAsia="en-IN" w:bidi="mr-IN"/>
+                <w:lang w:bidi="mr-IN"/>
               </w:rPr>
             </w:pPr>
             <w:r>
@@ -919,9 +929,9 @@
           <w:p>
             <w:pPr>
               <w:rPr>
-                <w:rFonts w:eastAsia="Times New Roman" w:cstheme="minorHAnsi"/>
+                <w:rFonts w:ascii="Calibri" w:eastAsia="Times New Roman" w:hAnsi="Calibri" w:cs="Calibri"/>
                 <w:color w:val="222222"/>
-                <w:lang w:eastAsia="en-IN" w:bidi="mr-IN"/>
+                <w:lang w:bidi="mr-IN"/>
               </w:rPr>
             </w:pPr>
             <w:r>
@@ -942,9 +952,9 @@
           <w:p>
             <w:pPr>
               <w:rPr>
-                <w:rFonts w:eastAsia="Times New Roman" w:cstheme="minorHAnsi"/>
+                <w:rFonts w:ascii="Calibri" w:eastAsia="Times New Roman" w:hAnsi="Calibri" w:cs="Calibri"/>
                 <w:color w:val="222222"/>
-                <w:lang w:eastAsia="en-IN" w:bidi="mr-IN"/>
+                <w:lang w:bidi="mr-IN"/>
               </w:rPr>
             </w:pPr>
             <w:r>
@@ -979,7 +989,7 @@
             <w:r>
               <w:rPr>
                 <w:rFonts w:ascii="Calibri" w:eastAsia="Times New Roman" w:hAnsi="Calibri" w:cs="Calibri"/>
-                <w:color w:val="222222"/>
+                <w:color w:val="000000"/>
                 <w:lang w:bidi="mr-IN"/>
               </w:rPr>
               <w:t>0</w:t>
@@ -987,19 +997,35 @@
             <w:r>
               <w:rPr>
                 <w:rFonts w:ascii="Calibri" w:eastAsia="Times New Roman" w:hAnsi="Calibri" w:cs="Calibri"/>
-                <w:color w:val="222222"/>
+                <w:color w:val="000000"/>
                 <w:lang w:bidi="mr-IN"/>
               </w:rPr>
-              <w:t xml:space="preserve">3 N </w:t>
+              <w:t xml:space="preserve">1 N </w:t>
             </w:r>
             <w:proofErr w:type="spellStart"/>
             <w:r>
               <w:rPr>
                 <w:rFonts w:ascii="Calibri" w:eastAsia="Times New Roman" w:hAnsi="Calibri" w:cs="Calibri"/>
-                <w:color w:val="222222"/>
+                <w:color w:val="000000"/>
                 <w:lang w:bidi="mr-IN"/>
               </w:rPr>
-              <w:t>Manali</w:t>
+              <w:t>Dhar</w:t>
+            </w:r>
+            <w:r>
+              <w:rPr>
+                <w:rFonts w:ascii="Calibri" w:eastAsia="Times New Roman" w:hAnsi="Calibri" w:cs="Calibri"/>
+                <w:color w:val="000000"/>
+                <w:lang w:bidi="mr-IN"/>
+              </w:rPr>
+              <w:t>a</w:t>
+            </w:r>
+            <w:r>
+              <w:rPr>
+                <w:rFonts w:ascii="Calibri" w:eastAsia="Times New Roman" w:hAnsi="Calibri" w:cs="Calibri"/>
+                <w:color w:val="000000"/>
+                <w:lang w:bidi="mr-IN"/>
+              </w:rPr>
+              <w:t>mshala</w:t>
             </w:r>
             <w:proofErr w:type="spellEnd"/>
           </w:p>
@@ -1023,7 +1049,7 @@
                 <w:color w:val="222222"/>
                 <w:lang w:eastAsia="en-IN" w:bidi="mr-IN"/>
               </w:rPr>
-              <w:t>08 Apr</w:t>
+              <w:t>07 Apr</w:t>
             </w:r>
           </w:p>
         </w:tc>
@@ -1046,7 +1072,7 @@
                 <w:color w:val="222222"/>
                 <w:lang w:eastAsia="en-IN" w:bidi="mr-IN"/>
               </w:rPr>
-              <w:t>11 Apr</w:t>
+              <w:t>08 Apr</w:t>
             </w:r>
           </w:p>
         </w:tc>
@@ -1167,26 +1193,36 @@
             <w:pPr>
               <w:rPr>
                 <w:rFonts w:ascii="Calibri" w:eastAsia="Times New Roman" w:hAnsi="Calibri" w:cs="Calibri"/>
+                <w:color w:val="000000"/>
+                <w:lang w:bidi="mr-IN"/>
+              </w:rPr>
+            </w:pPr>
+            <w:r>
+              <w:rPr>
+                <w:rFonts w:ascii="Calibri" w:eastAsia="Times New Roman" w:hAnsi="Calibri" w:cs="Calibri"/>
                 <w:color w:val="222222"/>
                 <w:lang w:bidi="mr-IN"/>
               </w:rPr>
-            </w:pPr>
+              <w:t>0</w:t>
+            </w:r>
             <w:r>
               <w:rPr>
                 <w:rFonts w:ascii="Calibri" w:eastAsia="Times New Roman" w:hAnsi="Calibri" w:cs="Calibri"/>
-                <w:color w:val="000000"/>
-                <w:lang w:val="en-US" w:bidi="mr-IN"/>
-              </w:rPr>
-              <w:t>0</w:t>
-            </w:r>
+                <w:color w:val="222222"/>
+                <w:lang w:bidi="mr-IN"/>
+              </w:rPr>
+              <w:t xml:space="preserve">3 N </w:t>
+            </w:r>
+            <w:proofErr w:type="spellStart"/>
             <w:r>
               <w:rPr>
                 <w:rFonts w:ascii="Calibri" w:eastAsia="Times New Roman" w:hAnsi="Calibri" w:cs="Calibri"/>
-                <w:color w:val="000000"/>
-                <w:lang w:val="en-US" w:bidi="mr-IN"/>
-              </w:rPr>
-              <w:t>2 N Shimla</w:t>
-            </w:r>
+                <w:color w:val="222222"/>
+                <w:lang w:bidi="mr-IN"/>
+              </w:rPr>
+              <w:t>Manali</w:t>
+            </w:r>
+            <w:proofErr w:type="spellEnd"/>
           </w:p>
         </w:tc>
         <w:tc>
@@ -1208,7 +1244,7 @@
                 <w:color w:val="222222"/>
                 <w:lang w:eastAsia="en-IN" w:bidi="mr-IN"/>
               </w:rPr>
-              <w:t>11 Apr</w:t>
+              <w:t>08 Apr</w:t>
             </w:r>
           </w:p>
         </w:tc>
@@ -1231,7 +1267,7 @@
                 <w:color w:val="222222"/>
                 <w:lang w:eastAsia="en-IN" w:bidi="mr-IN"/>
               </w:rPr>
-              <w:t>13 Apr</w:t>
+              <w:t>11 Apr</w:t>
             </w:r>
           </w:p>
         </w:tc>
@@ -1338,6 +1374,191 @@
           </w:p>
         </w:tc>
       </w:tr>
+      <w:tr>
+        <w:trPr>
+          <w:trHeight w:val="606"/>
+          <w:jc w:val="center"/>
+        </w:trPr>
+        <w:tc>
+          <w:tcPr>
+            <w:tcW w:w="1875" w:type="dxa"/>
+            <w:shd w:val="clear" w:color="auto" w:fill="FFF2CC" w:themeFill="accent4" w:themeFillTint="33"/>
+          </w:tcPr>
+          <w:p>
+            <w:pPr>
+              <w:rPr>
+                <w:rFonts w:ascii="Calibri" w:eastAsia="Times New Roman" w:hAnsi="Calibri" w:cs="Calibri"/>
+                <w:color w:val="222222"/>
+                <w:lang w:bidi="mr-IN"/>
+              </w:rPr>
+            </w:pPr>
+            <w:r>
+              <w:rPr>
+                <w:rFonts w:ascii="Calibri" w:eastAsia="Times New Roman" w:hAnsi="Calibri" w:cs="Calibri"/>
+                <w:color w:val="000000"/>
+                <w:lang w:val="en-US" w:bidi="mr-IN"/>
+              </w:rPr>
+              <w:t>0</w:t>
+            </w:r>
+            <w:r>
+              <w:rPr>
+                <w:rFonts w:ascii="Calibri" w:eastAsia="Times New Roman" w:hAnsi="Calibri" w:cs="Calibri"/>
+                <w:color w:val="000000"/>
+                <w:lang w:val="en-US" w:bidi="mr-IN"/>
+              </w:rPr>
+              <w:t>2 N Shimla</w:t>
+            </w:r>
+          </w:p>
+        </w:tc>
+        <w:tc>
+          <w:tcPr>
+            <w:tcW w:w="1081" w:type="dxa"/>
+            <w:shd w:val="clear" w:color="auto" w:fill="FFF2CC" w:themeFill="accent4" w:themeFillTint="33"/>
+          </w:tcPr>
+          <w:p>
+            <w:pPr>
+              <w:rPr>
+                <w:rFonts w:eastAsia="Times New Roman" w:cstheme="minorHAnsi"/>
+                <w:color w:val="222222"/>
+                <w:lang w:eastAsia="en-IN" w:bidi="mr-IN"/>
+              </w:rPr>
+            </w:pPr>
+            <w:r>
+              <w:rPr>
+                <w:rFonts w:eastAsia="Times New Roman" w:cstheme="minorHAnsi"/>
+                <w:color w:val="222222"/>
+                <w:lang w:eastAsia="en-IN" w:bidi="mr-IN"/>
+              </w:rPr>
+              <w:t>11 Apr</w:t>
+            </w:r>
+          </w:p>
+        </w:tc>
+        <w:tc>
+          <w:tcPr>
+            <w:tcW w:w="1081" w:type="dxa"/>
+            <w:shd w:val="clear" w:color="auto" w:fill="FFF2CC" w:themeFill="accent4" w:themeFillTint="33"/>
+          </w:tcPr>
+          <w:p>
+            <w:pPr>
+              <w:rPr>
+                <w:rFonts w:eastAsia="Times New Roman" w:cstheme="minorHAnsi"/>
+                <w:color w:val="222222"/>
+                <w:lang w:eastAsia="en-IN" w:bidi="mr-IN"/>
+              </w:rPr>
+            </w:pPr>
+            <w:r>
+              <w:rPr>
+                <w:rFonts w:eastAsia="Times New Roman" w:cstheme="minorHAnsi"/>
+                <w:color w:val="222222"/>
+                <w:lang w:eastAsia="en-IN" w:bidi="mr-IN"/>
+              </w:rPr>
+              <w:t>13 Apr</w:t>
+            </w:r>
+          </w:p>
+        </w:tc>
+        <w:tc>
+          <w:tcPr>
+            <w:tcW w:w="1007" w:type="dxa"/>
+            <w:shd w:val="clear" w:color="auto" w:fill="FFF2CC" w:themeFill="accent4" w:themeFillTint="33"/>
+          </w:tcPr>
+          <w:p>
+            <w:pPr>
+              <w:rPr>
+                <w:rFonts w:eastAsia="Times New Roman" w:cstheme="minorHAnsi"/>
+                <w:color w:val="222222"/>
+                <w:lang w:eastAsia="en-IN" w:bidi="mr-IN"/>
+              </w:rPr>
+            </w:pPr>
+            <w:r>
+              <w:rPr>
+                <w:rFonts w:eastAsia="Times New Roman" w:cstheme="minorHAnsi"/>
+                <w:color w:val="222222"/>
+                <w:lang w:eastAsia="en-IN" w:bidi="mr-IN"/>
+              </w:rPr>
+              <w:t>03</w:t>
+            </w:r>
+          </w:p>
+        </w:tc>
+        <w:tc>
+          <w:tcPr>
+            <w:tcW w:w="1391" w:type="dxa"/>
+            <w:shd w:val="clear" w:color="auto" w:fill="FFF2CC" w:themeFill="accent4" w:themeFillTint="33"/>
+            <w:vAlign w:val="center"/>
+          </w:tcPr>
+          <w:p>
+            <w:pPr>
+              <w:rPr>
+                <w:rFonts w:eastAsia="Times New Roman" w:cstheme="minorHAnsi"/>
+                <w:color w:val="222222"/>
+                <w:lang w:eastAsia="en-IN" w:bidi="mr-IN"/>
+              </w:rPr>
+            </w:pPr>
+            <w:r>
+              <w:rPr>
+                <w:rFonts w:ascii="Calibri" w:eastAsia="Times New Roman" w:hAnsi="Calibri" w:cs="Calibri"/>
+                <w:color w:val="222222"/>
+                <w:lang w:bidi="mr-IN"/>
+              </w:rPr>
+              <w:t>0</w:t>
+            </w:r>
+            <w:r>
+              <w:rPr>
+                <w:rFonts w:ascii="Calibri" w:eastAsia="Times New Roman" w:hAnsi="Calibri" w:cs="Calibri"/>
+                <w:color w:val="222222"/>
+                <w:lang w:bidi="mr-IN"/>
+              </w:rPr>
+              <w:t>1 Room  with Extra Mattress</w:t>
+            </w:r>
+          </w:p>
+        </w:tc>
+        <w:tc>
+          <w:tcPr>
+            <w:tcW w:w="1389" w:type="dxa"/>
+            <w:shd w:val="clear" w:color="auto" w:fill="FFF2CC" w:themeFill="accent4" w:themeFillTint="33"/>
+            <w:vAlign w:val="center"/>
+          </w:tcPr>
+          <w:p>
+            <w:pPr>
+              <w:rPr>
+                <w:rFonts w:eastAsia="Times New Roman" w:cstheme="minorHAnsi"/>
+                <w:color w:val="222222"/>
+                <w:lang w:eastAsia="en-IN" w:bidi="mr-IN"/>
+              </w:rPr>
+            </w:pPr>
+            <w:r>
+              <w:rPr>
+                <w:rFonts w:ascii="Calibri" w:eastAsia="Times New Roman" w:hAnsi="Calibri" w:cs="Calibri"/>
+                <w:color w:val="222222"/>
+                <w:lang w:bidi="mr-IN"/>
+              </w:rPr>
+              <w:t>Breakfast and Dinner</w:t>
+            </w:r>
+          </w:p>
+        </w:tc>
+        <w:tc>
+          <w:tcPr>
+            <w:tcW w:w="1674" w:type="dxa"/>
+            <w:shd w:val="clear" w:color="auto" w:fill="FFF2CC" w:themeFill="accent4" w:themeFillTint="33"/>
+          </w:tcPr>
+          <w:p>
+            <w:pPr>
+              <w:rPr>
+                <w:rFonts w:eastAsia="Times New Roman" w:cstheme="minorHAnsi"/>
+                <w:color w:val="222222"/>
+                <w:lang w:eastAsia="en-IN" w:bidi="mr-IN"/>
+              </w:rPr>
+            </w:pPr>
+            <w:r>
+              <w:rPr>
+                <w:rFonts w:ascii="Calibri" w:eastAsia="Times New Roman" w:hAnsi="Calibri" w:cs="Calibri"/>
+                <w:color w:val="222222"/>
+                <w:lang w:bidi="mr-IN"/>
+              </w:rPr>
+              <w:t>SEDAN</w:t>
+            </w:r>
+          </w:p>
+        </w:tc>
+      </w:tr>
     </w:tbl>
     <w:p>
       <w:pPr>
@@ -1400,8 +1621,6 @@
         </w:rPr>
         <w:t>Day wise Itinerary</w:t>
       </w:r>
-      <w:bookmarkStart w:id="0" w:name="_GoBack"/>
-      <w:bookmarkEnd w:id="0"/>
     </w:p>
     <w:p>
       <w:pPr>
@@ -1666,7 +1885,13 @@
           </w:tcPr>
           <w:p>
             <w:r>
-              <w:t xml:space="preserve">After breakfast, get ready to head to </w:t>
+              <w:t>After breakfast</w:t>
+            </w:r>
+            <w:r>
+              <w:t xml:space="preserve"> checkout from hotel</w:t>
+            </w:r>
+            <w:r>
+              <w:t xml:space="preserve">, get ready to head to </w:t>
             </w:r>
             <w:proofErr w:type="spellStart"/>
             <w:r>
@@ -1751,6 +1976,41 @@
           </w:p>
           <w:p>
             <w:r>
+              <w:t xml:space="preserve">Visit </w:t>
+            </w:r>
+            <w:proofErr w:type="spellStart"/>
+            <w:r>
+              <w:rPr>
+                <w:b/>
+                <w:bCs/>
+              </w:rPr>
+              <w:t>Khajjiar</w:t>
+            </w:r>
+            <w:proofErr w:type="spellEnd"/>
+            <w:r>
+              <w:rPr>
+                <w:b/>
+                <w:bCs/>
+              </w:rPr>
+              <w:t xml:space="preserve"> Lake</w:t>
+            </w:r>
+            <w:r>
+              <w:t>,</w:t>
+            </w:r>
+            <w:r>
+              <w:t xml:space="preserve"> The heart of </w:t>
+            </w:r>
+            <w:proofErr w:type="spellStart"/>
+            <w:r>
+              <w:t>Khajjiar</w:t>
+            </w:r>
+            <w:proofErr w:type="spellEnd"/>
+            <w:r>
+              <w:t>, surrounded by cedar forests and lush meadows.</w:t>
+            </w:r>
+          </w:p>
+          <w:p>
+            <w:r>
               <w:t xml:space="preserve">Later, get ready to proceed to </w:t>
             </w:r>
             <w:proofErr w:type="spellStart"/>
@@ -1778,14 +2038,81 @@
               <w:t>Khajjiar</w:t>
             </w:r>
             <w:proofErr w:type="spellEnd"/>
-            <w:r>
-              <w:t>) and after</w:t>
-            </w:r>
-            <w:r>
+            <w:proofErr w:type="gramStart"/>
+            <w:r>
+              <w:t xml:space="preserve">) </w:t>
+            </w:r>
+            <w:r>
+              <w:t>.</w:t>
+            </w:r>
+            <w:proofErr w:type="gramEnd"/>
+          </w:p>
+          <w:p>
+            <w:r>
+              <w:t xml:space="preserve">Visit </w:t>
+            </w:r>
+            <w:proofErr w:type="spellStart"/>
+            <w:r>
+              <w:rPr>
+                <w:b/>
+                <w:bCs/>
+              </w:rPr>
+              <w:t>Chamera</w:t>
+            </w:r>
+            <w:proofErr w:type="spellEnd"/>
+            <w:r>
+              <w:rPr>
+                <w:b/>
+                <w:bCs/>
+              </w:rPr>
+              <w:t xml:space="preserve"> Lake</w:t>
+            </w:r>
+            <w:r>
+              <w:rPr>
+                <w:b/>
+                <w:bCs/>
+              </w:rPr>
               <w:t xml:space="preserve"> </w:t>
             </w:r>
             <w:r>
-              <w:t xml:space="preserve">exploring the sights, get back to Dalhousie. </w:t>
+              <w:t xml:space="preserve">is a stunning man-made reservoir created by the </w:t>
+            </w:r>
+            <w:proofErr w:type="spellStart"/>
+            <w:r>
+              <w:t>Chamera</w:t>
+            </w:r>
+            <w:proofErr w:type="spellEnd"/>
+            <w:r>
+              <w:t xml:space="preserve"> Dam on the Ravi River</w:t>
+            </w:r>
+            <w:r>
+              <w:t>.</w:t>
+            </w:r>
+          </w:p>
+          <w:p/>
+          <w:p>
+            <w:r>
+              <w:t>In the evening check</w:t>
+            </w:r>
+            <w:r>
+              <w:t xml:space="preserve"> in</w:t>
+            </w:r>
+            <w:r>
+              <w:t xml:space="preserve">to hotel </w:t>
+            </w:r>
+            <w:r>
+              <w:t>at</w:t>
+            </w:r>
+            <w:r>
+              <w:t xml:space="preserve"> </w:t>
+            </w:r>
+            <w:proofErr w:type="spellStart"/>
+            <w:r>
+              <w:t>Khajjar</w:t>
+            </w:r>
+            <w:proofErr w:type="spellEnd"/>
+            <w:r>
+              <w:t>.</w:t>
             </w:r>
           </w:p>
           <w:p>
@@ -1793,7 +2120,21 @@
               <w:t>Dinner and Overnight stay</w:t>
             </w:r>
             <w:r>
-              <w:t xml:space="preserve"> at hotel in Dalhousie.</w:t>
+              <w:t xml:space="preserve"> at hotel </w:t>
+            </w:r>
+            <w:r>
+              <w:t>at</w:t>
+            </w:r>
+            <w:r>
+              <w:t xml:space="preserve"> </w:t>
+            </w:r>
+            <w:proofErr w:type="spellStart"/>
+            <w:r>
+              <w:t>Khajjar</w:t>
+            </w:r>
+            <w:proofErr w:type="spellEnd"/>
+            <w:r>
+              <w:t>.</w:t>
             </w:r>
           </w:p>
         </w:tc>
@@ -2029,25 +2370,13 @@
             </w:r>
             <w:proofErr w:type="spellEnd"/>
             <w:r>
-              <w:t xml:space="preserve"> is one of the most beautiful cricket stadiums in the world.</w:t>
-            </w:r>
-            <w:r>
-              <w:t xml:space="preserve"> </w:t>
-            </w:r>
-            <w:r>
-              <w:t>Open to visitors when no matches are scheduled</w:t>
-            </w:r>
-            <w:r>
-              <w:t>.</w:t>
+              <w:t xml:space="preserve"> is one of the most beautiful cricket stadiums in the world. Open to visitors when no matches are scheduled.</w:t>
             </w:r>
           </w:p>
           <w:p/>
           <w:p>
             <w:r>
-              <w:t>V</w:t>
-            </w:r>
-            <w:r>
-              <w:t xml:space="preserve">isit to the famous Tibetan Medical Centre, where treatment is done using rare Tibetan medicines. </w:t>
+              <w:t xml:space="preserve">Visit to the famous Tibetan Medical Centre, where treatment is done using rare Tibetan medicines. </w:t>
             </w:r>
           </w:p>
           <w:p>
@@ -2396,43 +2725,98 @@
             <w:r>
               <w:t xml:space="preserve"> </w:t>
             </w:r>
-            <w:proofErr w:type="spellStart"/>
             <w:r>
               <w:t>snow</w:t>
             </w:r>
             <w:r>
+              <w:t>-</w:t>
+            </w:r>
+            <w:r>
+              <w:t>capped</w:t>
+            </w:r>
+            <w:r>
+              <w:t xml:space="preserve"> peaks and rivers attract visitors as well. Also halt at Nehru </w:t>
+            </w:r>
+            <w:proofErr w:type="spellStart"/>
+            <w:r>
+              <w:t>Kund</w:t>
+            </w:r>
+            <w:proofErr w:type="spellEnd"/>
+            <w:r>
+              <w:t>. Then</w:t>
+            </w:r>
+            <w:r>
               <w:t xml:space="preserve"> </w:t>
             </w:r>
             <w:r>
-              <w:t>capped</w:t>
-            </w:r>
-            <w:proofErr w:type="spellEnd"/>
-            <w:r>
-              <w:t xml:space="preserve"> peaks and rivers attract visitors as well. Also halt at Nehru </w:t>
-            </w:r>
-            <w:proofErr w:type="spellStart"/>
-            <w:r>
-              <w:t>Kund</w:t>
-            </w:r>
-            <w:proofErr w:type="spellEnd"/>
-            <w:r>
-              <w:t>. Then</w:t>
+              <w:t xml:space="preserve">proceed towards </w:t>
+            </w:r>
+            <w:r>
+              <w:rPr>
+                <w:b/>
+                <w:bCs/>
+              </w:rPr>
+              <w:t>Atal Tunnel</w:t>
+            </w:r>
+            <w:r>
+              <w:t xml:space="preserve">. Atal tunnel starts from </w:t>
+            </w:r>
+            <w:proofErr w:type="spellStart"/>
+            <w:r>
+              <w:t>Solang</w:t>
+            </w:r>
+            <w:proofErr w:type="spellEnd"/>
+            <w:r>
+              <w:t xml:space="preserve">, and the total distance </w:t>
+            </w:r>
+            <w:proofErr w:type="spellStart"/>
+            <w:r>
+              <w:t>oftunnel</w:t>
+            </w:r>
+            <w:proofErr w:type="spellEnd"/>
+            <w:r>
+              <w:t xml:space="preserve"> is 17 </w:t>
+            </w:r>
+            <w:proofErr w:type="spellStart"/>
+            <w:r>
+              <w:t>kms</w:t>
+            </w:r>
+            <w:proofErr w:type="spellEnd"/>
+            <w:r>
+              <w:t xml:space="preserve"> one way and takes 1hr 15 min one way and tunnel ends at a place</w:t>
             </w:r>
             <w:r>
               <w:t xml:space="preserve"> </w:t>
             </w:r>
             <w:r>
-              <w:t xml:space="preserve">proceed towards </w:t>
-            </w:r>
-            <w:r>
-              <w:rPr>
-                <w:b/>
-                <w:bCs/>
-              </w:rPr>
-              <w:t>Atal Tunnel</w:t>
-            </w:r>
-            <w:r>
-              <w:t xml:space="preserve">. Atal tunnel starts from </w:t>
+              <w:t xml:space="preserve">called </w:t>
+            </w:r>
+            <w:proofErr w:type="gramStart"/>
+            <w:r>
+              <w:rPr>
+                <w:b/>
+                <w:bCs/>
+              </w:rPr>
+              <w:t>SISSU</w:t>
+            </w:r>
+            <w:r>
+              <w:t xml:space="preserve"> .</w:t>
+            </w:r>
+            <w:proofErr w:type="gramEnd"/>
+            <w:r>
+              <w:t xml:space="preserve"> </w:t>
+            </w:r>
+          </w:p>
+          <w:p/>
+          <w:p>
+            <w:pPr>
+              <w:rPr>
+                <w:b/>
+                <w:bCs/>
+              </w:rPr>
+            </w:pPr>
+            <w:r>
+              <w:t xml:space="preserve">On the way back they can do activities at </w:t>
             </w:r>
             <w:proofErr w:type="spellStart"/>
             <w:r>
@@ -2440,52 +2824,153 @@
             </w:r>
             <w:proofErr w:type="spellEnd"/>
             <w:r>
-              <w:t xml:space="preserve">, and the total distance </w:t>
-            </w:r>
-            <w:proofErr w:type="spellStart"/>
-            <w:r>
-              <w:t>oftunnel</w:t>
-            </w:r>
-            <w:proofErr w:type="spellEnd"/>
-            <w:r>
-              <w:t xml:space="preserve"> is 17 </w:t>
-            </w:r>
-            <w:proofErr w:type="spellStart"/>
-            <w:r>
-              <w:t>kms</w:t>
-            </w:r>
-            <w:proofErr w:type="spellEnd"/>
-            <w:r>
-              <w:t xml:space="preserve"> one way and takes 1hr 15 min one way and tunnel ends at a place</w:t>
-            </w:r>
+              <w:t xml:space="preserve"> valley sports </w:t>
+            </w:r>
+            <w:proofErr w:type="spellStart"/>
+            <w:r>
+              <w:t>center</w:t>
+            </w:r>
+            <w:proofErr w:type="spellEnd"/>
             <w:r>
               <w:t xml:space="preserve"> </w:t>
             </w:r>
             <w:r>
-              <w:t xml:space="preserve">called </w:t>
-            </w:r>
-            <w:proofErr w:type="gramStart"/>
-            <w:r>
-              <w:rPr>
-                <w:b/>
-                <w:bCs/>
-              </w:rPr>
-              <w:t>SISSU</w:t>
-            </w:r>
-            <w:r>
-              <w:t xml:space="preserve"> .</w:t>
-            </w:r>
-            <w:proofErr w:type="gramEnd"/>
-            <w:r>
-              <w:t xml:space="preserve"> On the way back they can do activities at </w:t>
-            </w:r>
-            <w:proofErr w:type="spellStart"/>
-            <w:r>
+              <w:t>and</w:t>
+            </w:r>
+            <w:r>
+              <w:rPr>
+                <w:b/>
+                <w:bCs/>
+              </w:rPr>
+              <w:t xml:space="preserve"> </w:t>
+            </w:r>
+            <w:proofErr w:type="spellStart"/>
+            <w:r>
+              <w:rPr>
+                <w:b/>
+                <w:bCs/>
+              </w:rPr>
               <w:t>Solang</w:t>
             </w:r>
             <w:proofErr w:type="spellEnd"/>
             <w:r>
-              <w:t>. By evening, return to</w:t>
+              <w:rPr>
+                <w:b/>
+                <w:bCs/>
+              </w:rPr>
+              <w:t xml:space="preserve"> Ropeway &amp; Ski </w:t>
+            </w:r>
+            <w:proofErr w:type="spellStart"/>
+            <w:r>
+              <w:rPr>
+                <w:b/>
+                <w:bCs/>
+              </w:rPr>
+              <w:t>Center</w:t>
+            </w:r>
+            <w:proofErr w:type="spellEnd"/>
+            <w:r>
+              <w:rPr>
+                <w:b/>
+                <w:bCs/>
+              </w:rPr>
+              <w:t>.</w:t>
+            </w:r>
+          </w:p>
+          <w:p>
+            <w:r>
+              <w:t>You can t</w:t>
+            </w:r>
+            <w:r>
+              <w:t xml:space="preserve">rek to </w:t>
+            </w:r>
+            <w:proofErr w:type="spellStart"/>
+            <w:r>
+              <w:rPr>
+                <w:b/>
+                <w:bCs/>
+              </w:rPr>
+              <w:t>Anjani</w:t>
+            </w:r>
+            <w:proofErr w:type="spellEnd"/>
+            <w:r>
+              <w:rPr>
+                <w:b/>
+                <w:bCs/>
+              </w:rPr>
+              <w:t xml:space="preserve"> </w:t>
+            </w:r>
+            <w:proofErr w:type="spellStart"/>
+            <w:r>
+              <w:rPr>
+                <w:b/>
+                <w:bCs/>
+              </w:rPr>
+              <w:t>Mahadev</w:t>
+            </w:r>
+            <w:proofErr w:type="spellEnd"/>
+            <w:r>
+              <w:rPr>
+                <w:b/>
+                <w:bCs/>
+              </w:rPr>
+              <w:t xml:space="preserve"> Temple</w:t>
+            </w:r>
+            <w:r>
+              <w:rPr>
+                <w:b/>
+                <w:bCs/>
+              </w:rPr>
+              <w:t xml:space="preserve"> </w:t>
+            </w:r>
+            <w:r>
+              <w:t xml:space="preserve">or take a pony ride </w:t>
+            </w:r>
+            <w:r>
+              <w:t>it’s</w:t>
+            </w:r>
+            <w:r>
+              <w:t xml:space="preserve"> almost 3km one-way</w:t>
+            </w:r>
+            <w:r>
+              <w:rPr>
+                <w:b/>
+                <w:bCs/>
+              </w:rPr>
+              <w:t xml:space="preserve">, </w:t>
+            </w:r>
+            <w:r>
+              <w:t xml:space="preserve">is a sacred shrine dedicated to Lord Shiva, located in </w:t>
+            </w:r>
+            <w:proofErr w:type="spellStart"/>
+            <w:r>
+              <w:t>Solang</w:t>
+            </w:r>
+            <w:proofErr w:type="spellEnd"/>
+            <w:r>
+              <w:t xml:space="preserve"> Valley, near </w:t>
+            </w:r>
+            <w:proofErr w:type="spellStart"/>
+            <w:r>
+              <w:t>Manali</w:t>
+            </w:r>
+            <w:proofErr w:type="spellEnd"/>
+            <w:r>
+              <w:t xml:space="preserve">. It is famous for the naturally forming Shiva Lingam, which gets covered with a thick layer of ice during winter, resembling </w:t>
+            </w:r>
+            <w:proofErr w:type="spellStart"/>
+            <w:r>
+              <w:t>Amarnath</w:t>
+            </w:r>
+            <w:proofErr w:type="spellEnd"/>
+            <w:r>
+              <w:t xml:space="preserve"> Cave.</w:t>
+            </w:r>
+          </w:p>
+          <w:p/>
+          <w:p>
+            <w:r>
+              <w:t>By evening, return to</w:t>
             </w:r>
             <w:r>
               <w:t xml:space="preserve"> </w:t>
@@ -2689,6 +3174,7 @@
                 <w:b/>
                 <w:bCs/>
               </w:rPr>
+              <w:lastRenderedPageBreak/>
               <w:t xml:space="preserve">Day </w:t>
             </w:r>
             <w:r>
@@ -2959,10 +3445,7 @@
             </w:r>
             <w:proofErr w:type="gramEnd"/>
             <w:r>
-              <w:t xml:space="preserve"> a</w:t>
-            </w:r>
-            <w:r>
-              <w:t xml:space="preserve"> beautiful park with tall deodar trees and a small lake for boating.</w:t>
+              <w:t xml:space="preserve"> a beautiful park with tall deodar trees and a small lake for boating.</w:t>
             </w:r>
           </w:p>
           <w:p>
@@ -2988,10 +3471,73 @@
               <w:t xml:space="preserve"> with games, boating, and shopping.</w:t>
             </w:r>
           </w:p>
+          <w:p>
+            <w:proofErr w:type="spellStart"/>
+            <w:r>
+              <w:rPr>
+                <w:b/>
+                <w:bCs/>
+              </w:rPr>
+              <w:t>Siyali</w:t>
+            </w:r>
+            <w:proofErr w:type="spellEnd"/>
+            <w:r>
+              <w:rPr>
+                <w:b/>
+                <w:bCs/>
+              </w:rPr>
+              <w:t xml:space="preserve"> </w:t>
+            </w:r>
+            <w:proofErr w:type="spellStart"/>
+            <w:r>
+              <w:rPr>
+                <w:b/>
+                <w:bCs/>
+              </w:rPr>
+              <w:t>Mahadev</w:t>
+            </w:r>
+            <w:proofErr w:type="spellEnd"/>
+            <w:r>
+              <w:rPr>
+                <w:b/>
+                <w:bCs/>
+              </w:rPr>
+              <w:t xml:space="preserve"> Temple</w:t>
+            </w:r>
+            <w:r>
+              <w:t xml:space="preserve"> (Ancient Shiva Temple in Peaceful Setting) Dedicated to: Lord Shiva</w:t>
+            </w:r>
+          </w:p>
+          <w:p>
+            <w:r>
+              <w:rPr>
+                <w:b/>
+                <w:bCs/>
+              </w:rPr>
+              <w:t>Tibetan Monasteries</w:t>
+            </w:r>
+            <w:r>
+              <w:t xml:space="preserve"> </w:t>
+            </w:r>
+            <w:proofErr w:type="spellStart"/>
+            <w:r>
+              <w:t>Manali</w:t>
+            </w:r>
+            <w:proofErr w:type="spellEnd"/>
+            <w:r>
+              <w:t xml:space="preserve"> is home to beautiful Tibetan monasteries that reflect peace, spirituality, and Buddhist culture.</w:t>
+            </w:r>
+          </w:p>
           <w:p/>
           <w:p>
             <w:r>
-              <w:t xml:space="preserve">Return to hotel by late afternoon. Rest of the day at leisure. </w:t>
+              <w:t xml:space="preserve">Return to hotel by </w:t>
+            </w:r>
+            <w:r>
+              <w:t>evening</w:t>
+            </w:r>
+            <w:r>
+              <w:t xml:space="preserve">. Rest of the day at leisure. </w:t>
             </w:r>
           </w:p>
           <w:p>
@@ -3152,10 +3698,7 @@
               <w:t xml:space="preserve"> proceed towards </w:t>
             </w:r>
             <w:r>
-              <w:t>Shimla</w:t>
-            </w:r>
-            <w:r>
-              <w:t xml:space="preserve">. </w:t>
+              <w:t xml:space="preserve">Shimla. </w:t>
             </w:r>
             <w:proofErr w:type="spellStart"/>
             <w:r>
@@ -3163,84 +3706,75 @@
             </w:r>
             <w:proofErr w:type="spellEnd"/>
             <w:r>
+              <w:t xml:space="preserve"> stop at </w:t>
+            </w:r>
+            <w:proofErr w:type="spellStart"/>
+            <w:r>
+              <w:rPr>
+                <w:b/>
+                <w:bCs/>
+              </w:rPr>
+              <w:t>kullu</w:t>
+            </w:r>
+            <w:proofErr w:type="spellEnd"/>
+            <w:r>
+              <w:t xml:space="preserve">, known for </w:t>
+            </w:r>
+            <w:r>
+              <w:rPr>
+                <w:b/>
+                <w:bCs/>
+              </w:rPr>
+              <w:t>River rafting</w:t>
+            </w:r>
+            <w:r>
+              <w:t xml:space="preserve"> (at own cost). </w:t>
+            </w:r>
+            <w:r>
+              <w:t>I</w:t>
+            </w:r>
+            <w:r>
+              <w:t>f time permits</w:t>
+            </w:r>
+            <w:r>
+              <w:t xml:space="preserve"> also </w:t>
+            </w:r>
+            <w:r>
+              <w:t xml:space="preserve">visit </w:t>
+            </w:r>
+            <w:proofErr w:type="spellStart"/>
+            <w:r>
+              <w:rPr>
+                <w:b/>
+                <w:bCs/>
+              </w:rPr>
+              <w:t>Sundernagar</w:t>
+            </w:r>
+            <w:proofErr w:type="spellEnd"/>
+            <w:r>
+              <w:rPr>
+                <w:b/>
+                <w:bCs/>
+              </w:rPr>
+              <w:t xml:space="preserve"> lake, </w:t>
+            </w:r>
+            <w:proofErr w:type="spellStart"/>
+            <w:r>
+              <w:rPr>
+                <w:b/>
+                <w:bCs/>
+              </w:rPr>
+              <w:t>Pandoh</w:t>
+            </w:r>
+            <w:proofErr w:type="spellEnd"/>
+            <w:r>
+              <w:rPr>
+                <w:b/>
+                <w:bCs/>
+              </w:rPr>
               <w:t xml:space="preserve"> </w:t>
             </w:r>
             <w:r>
-              <w:t>s</w:t>
-            </w:r>
-            <w:r>
-              <w:t xml:space="preserve">top at </w:t>
-            </w:r>
-            <w:proofErr w:type="spellStart"/>
-            <w:r>
-              <w:rPr>
-                <w:b/>
-                <w:bCs/>
-              </w:rPr>
-              <w:t>kullu</w:t>
-            </w:r>
-            <w:proofErr w:type="spellEnd"/>
-            <w:r>
-              <w:t xml:space="preserve">, known for </w:t>
-            </w:r>
-            <w:r>
-              <w:rPr>
-                <w:b/>
-                <w:bCs/>
-              </w:rPr>
-              <w:t>River rafting</w:t>
-            </w:r>
-            <w:r>
-              <w:t xml:space="preserve"> (at own cost).</w:t>
-            </w:r>
-            <w:r>
-              <w:t xml:space="preserve"> </w:t>
-            </w:r>
-            <w:r>
-              <w:t>I</w:t>
-            </w:r>
-            <w:r>
-              <w:t>f time permits</w:t>
-            </w:r>
-            <w:r>
-              <w:t xml:space="preserve"> also </w:t>
-            </w:r>
-            <w:r>
-              <w:t xml:space="preserve">visit </w:t>
-            </w:r>
-            <w:proofErr w:type="spellStart"/>
-            <w:r>
-              <w:rPr>
-                <w:b/>
-                <w:bCs/>
-              </w:rPr>
-              <w:t>Sundernagar</w:t>
-            </w:r>
-            <w:proofErr w:type="spellEnd"/>
-            <w:r>
-              <w:rPr>
-                <w:b/>
-                <w:bCs/>
-              </w:rPr>
-              <w:t xml:space="preserve"> lake, </w:t>
-            </w:r>
-            <w:proofErr w:type="spellStart"/>
-            <w:r>
-              <w:rPr>
-                <w:b/>
-                <w:bCs/>
-              </w:rPr>
-              <w:t>Pandoh</w:t>
-            </w:r>
-            <w:proofErr w:type="spellEnd"/>
-            <w:r>
-              <w:rPr>
-                <w:b/>
-                <w:bCs/>
-              </w:rPr>
-              <w:t xml:space="preserve"> </w:t>
-            </w:r>
-            <w:r>
               <w:rPr>
                 <w:b/>
                 <w:bCs/>
@@ -3268,14 +3802,7 @@
                 <w:b/>
                 <w:bCs/>
               </w:rPr>
-              <w:t>l factory</w:t>
-            </w:r>
-            <w:r>
-              <w:rPr>
-                <w:b/>
-                <w:bCs/>
-              </w:rPr>
-              <w:t xml:space="preserve">, and </w:t>
+              <w:t xml:space="preserve">l factory, and </w:t>
             </w:r>
             <w:proofErr w:type="spellStart"/>
             <w:r>
@@ -3522,6 +4049,72 @@
             <w:r>
               <w:t xml:space="preserve"> </w:t>
             </w:r>
+          </w:p>
+          <w:p>
+            <w:r>
+              <w:t xml:space="preserve">On the way take breath-taking view of </w:t>
+            </w:r>
+            <w:r>
+              <w:rPr>
+                <w:b/>
+                <w:bCs/>
+              </w:rPr>
+              <w:t>Green valley</w:t>
+            </w:r>
+            <w:r>
+              <w:rPr>
+                <w:b/>
+                <w:bCs/>
+              </w:rPr>
+              <w:t xml:space="preserve"> </w:t>
+            </w:r>
+            <w:r>
+              <w:t>a</w:t>
+            </w:r>
+            <w:r>
+              <w:t xml:space="preserve"> picturesque viewpoint, covered in dense deodar and pine forests.</w:t>
+            </w:r>
+          </w:p>
+          <w:p>
+            <w:proofErr w:type="spellStart"/>
+            <w:r>
+              <w:rPr>
+                <w:b/>
+                <w:bCs/>
+              </w:rPr>
+              <w:t>Kufri</w:t>
+            </w:r>
+            <w:proofErr w:type="spellEnd"/>
+            <w:r>
+              <w:rPr>
+                <w:b/>
+                <w:bCs/>
+              </w:rPr>
+              <w:t xml:space="preserve"> Fun World</w:t>
+            </w:r>
+            <w:proofErr w:type="gramStart"/>
+            <w:r>
+              <w:rPr>
+                <w:b/>
+                <w:bCs/>
+              </w:rPr>
+              <w:t>,</w:t>
+            </w:r>
+            <w:r>
+              <w:t xml:space="preserve"> </w:t>
+            </w:r>
+            <w:r>
+              <w:t xml:space="preserve"> o</w:t>
+            </w:r>
+            <w:r>
+              <w:t>ne</w:t>
+            </w:r>
+            <w:proofErr w:type="gramEnd"/>
+            <w:r>
+              <w:t xml:space="preserve"> of the highest amusement parks in the world (2,800 meters altitude). Enjoy Go-karting, rides, and breath-taking Himalayan views.</w:t>
+            </w:r>
+          </w:p>
+          <w:p>
             <w:r>
               <w:rPr>
                 <w:b/>
@@ -3534,6 +4127,42 @@
             </w:r>
           </w:p>
           <w:p>
+            <w:proofErr w:type="spellStart"/>
+            <w:r>
+              <w:rPr>
+                <w:b/>
+                <w:bCs/>
+              </w:rPr>
+              <w:t>Mahasu</w:t>
+            </w:r>
+            <w:proofErr w:type="spellEnd"/>
+            <w:r>
+              <w:rPr>
+                <w:b/>
+                <w:bCs/>
+              </w:rPr>
+              <w:t xml:space="preserve"> Peak </w:t>
+            </w:r>
+            <w:r>
+              <w:t xml:space="preserve">Highest point in </w:t>
+            </w:r>
+            <w:proofErr w:type="spellStart"/>
+            <w:r>
+              <w:t>Kufri</w:t>
+            </w:r>
+            <w:proofErr w:type="spellEnd"/>
+            <w:r>
+              <w:t xml:space="preserve"> with 360° views of Himalayan peaks. Accessible by trekking or horse/mule ride </w:t>
+            </w:r>
+            <w:r>
+              <w:t>(at own cost</w:t>
+            </w:r>
+            <w:r>
+              <w:t>).</w:t>
+            </w:r>
+          </w:p>
+          <w:p/>
+          <w:p>
             <w:r>
               <w:t xml:space="preserve">After, visit the famous </w:t>
             </w:r>
@@ -3598,6 +4227,7 @@
           </w:p>
           <w:p>
             <w:r>
+              <w:lastRenderedPageBreak/>
               <w:t xml:space="preserve"> </w:t>
             </w:r>
             <w:r>
@@ -5404,7 +6034,7 @@
       <w:rPr>
         <w:noProof/>
       </w:rPr>
-      <w:t>27-02-2025</w:t>
+      <w:t>28-02-2025</w:t>
     </w:r>
     <w:r>
       <w:fldChar w:fldCharType="end"/>
@@ -5725,7 +6355,7 @@
         </mc:Choice>
         <mc:Fallback>
           <w:pict>
-            <v:line w14:anchorId="79B92788" id="Straight Connector 3" o:spid="_x0000_s1026" style="position:absolute;z-index:251659264;visibility:visible;mso-wrap-style:square;mso-wrap-distance-left:9pt;mso-wrap-distance-top:0;mso-wrap-distance-right:9pt;mso-wrap-distance-bottom:0;mso-position-horizontal:absolute;mso-position-horizontal-relative:text;mso-position-vertical:absolute;mso-position-vertical-relative:text" from="-41.25pt,9.2pt" to="494.25pt,9.95pt" o:gfxdata="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" strokecolor="black [3200]" strokeweight=".5pt">
+            <v:line w14:anchorId="7AC3E1BC" id="Straight Connector 3" o:spid="_x0000_s1026" style="position:absolute;z-index:251659264;visibility:visible;mso-wrap-style:square;mso-wrap-distance-left:9pt;mso-wrap-distance-top:0;mso-wrap-distance-right:9pt;mso-wrap-distance-bottom:0;mso-position-horizontal:absolute;mso-position-horizontal-relative:text;mso-position-vertical:absolute;mso-position-vertical-relative:text" from="-41.25pt,9.2pt" to="494.25pt,9.95pt" o:gfxdata="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" strokecolor="black [3200]" strokeweight=".5pt">
               <v:stroke joinstyle="miter"/>
             </v:line>
           </w:pict>

</xml_diff>